<commit_message>
Document qwen3 LibreChat setup
</commit_message>
<xml_diff>
--- a/docs/JUNIOR_DEVOPS_DEPLOYMENT_GUIDE.docx
+++ b/docs/JUNIOR_DEVOPS_DEPLOYMENT_GUIDE.docx
@@ -1383,7 +1383,22 @@
           <w:rFonts w:ascii="Arial" w:hAnsi="Arial"/>
           <w:sz w:val="22"/>
         </w:rPr>
-        <w:t>выполнять read-only SELECT-запросы;</w:t>
+        <w:t xml:space="preserve">находить все и непустые таблицы в базе </w:t>
+      </w:r>
+      <w:r>
+        <w:rPr>
+          <w:rFonts w:ascii="Courier New" w:hAnsi="Courier New"/>
+          <w:color w:val="141414"/>
+          <w:sz w:val="20"/>
+        </w:rPr>
+        <w:t>analytics</w:t>
+      </w:r>
+      <w:r>
+        <w:rPr>
+          <w:rFonts w:ascii="Arial" w:hAnsi="Arial"/>
+          <w:sz w:val="22"/>
+        </w:rPr>
+        <w:t>;</w:t>
       </w:r>
     </w:p>
     <w:p>
@@ -1395,6 +1410,57 @@
           <w:rFonts w:ascii="Arial" w:hAnsi="Arial"/>
           <w:sz w:val="22"/>
         </w:rPr>
+        <w:t xml:space="preserve">профилировать любую актуальную таблицу из </w:t>
+      </w:r>
+      <w:r>
+        <w:rPr>
+          <w:rFonts w:ascii="Courier New" w:hAnsi="Courier New"/>
+          <w:color w:val="141414"/>
+          <w:sz w:val="20"/>
+        </w:rPr>
+        <w:t>analytics</w:t>
+      </w:r>
+      <w:r>
+        <w:rPr>
+          <w:rFonts w:ascii="Arial" w:hAnsi="Arial"/>
+          <w:sz w:val="22"/>
+        </w:rPr>
+        <w:t>;</w:t>
+      </w:r>
+    </w:p>
+    <w:p>
+      <w:pPr>
+        <w:pStyle w:val="ListBullet"/>
+      </w:pPr>
+      <w:r>
+        <w:rPr>
+          <w:rFonts w:ascii="Arial" w:hAnsi="Arial"/>
+          <w:sz w:val="22"/>
+        </w:rPr>
+        <w:t>выбирать sample rows;</w:t>
+      </w:r>
+    </w:p>
+    <w:p>
+      <w:pPr>
+        <w:pStyle w:val="ListBullet"/>
+      </w:pPr>
+      <w:r>
+        <w:rPr>
+          <w:rFonts w:ascii="Arial" w:hAnsi="Arial"/>
+          <w:sz w:val="22"/>
+        </w:rPr>
+        <w:t>считать уникальные значения и распределения по указанным колонкам;</w:t>
+      </w:r>
+    </w:p>
+    <w:p>
+      <w:pPr>
+        <w:pStyle w:val="ListBullet"/>
+      </w:pPr>
+      <w:r>
+        <w:rPr>
+          <w:rFonts w:ascii="Arial" w:hAnsi="Arial"/>
+          <w:sz w:val="22"/>
+        </w:rPr>
         <w:t>считать error rate;</w:t>
       </w:r>
     </w:p>
@@ -1420,6 +1486,15 @@
           <w:sz w:val="22"/>
         </w:rPr>
         <w:t>возвращать ссылки на Grafana.</w:t>
+      </w:r>
+    </w:p>
+    <w:p>
+      <w:r>
+        <w:rPr>
+          <w:rFonts w:ascii="Arial" w:hAnsi="Arial"/>
+          <w:sz w:val="22"/>
+        </w:rPr>
+        <w:t>Сырой SQL-tool в LibreChat не публикуется. Модель должна понять вопрос пользователя, выбрать подходящий ClickHouse MCP tool, дождаться live-ответа ClickHouse и только после этого сформулировать ответ. Это важно, потому что таблицы и данные могут измениться после написания документации.</w:t>
       </w:r>
     </w:p>
     <w:p>
@@ -11558,7 +11633,7 @@
           <w:rFonts w:ascii="Courier New" w:hAnsi="Courier New"/>
           <w:sz w:val="17"/>
         </w:rPr>
-        <w:t>OPENAI_MODEL_SMART=qwen2.5:14b</w:t>
+        <w:t>OPENAI_MODEL_SMART=qwen3:14b</w:t>
       </w:r>
       <w:r>
         <w:br/>
@@ -11588,7 +11663,7 @@
           <w:rFonts w:ascii="Courier New" w:hAnsi="Courier New"/>
           <w:sz w:val="17"/>
         </w:rPr>
-        <w:t>LIBRECHAT_MODELS=qwen2.5:7b,qwen2.5:14b,llama3.2-vision:latest</w:t>
+        <w:t>LIBRECHAT_MODELS=qwen2.5:7b,qwen2.5:14b,qwen3:14b,llama3.2-vision:latest</w:t>
       </w:r>
       <w:r>
         <w:br/>
@@ -19501,25 +19576,266 @@
         <w:pStyle w:val="Heading3"/>
       </w:pPr>
       <w:r>
-        <w:t>7.11 Создать Минимальный MCP Server</w:t>
-      </w:r>
-    </w:p>
-    <w:p>
-      <w:r>
-        <w:rPr>
-          <w:rFonts w:ascii="Arial" w:hAnsi="Arial"/>
-          <w:sz w:val="22"/>
-        </w:rPr>
-        <w:t>MCP server можно начать с минимальной версии: healthcheck и read-only SELECT в ClickHouse.</w:t>
-      </w:r>
-    </w:p>
-    <w:p>
-      <w:r>
-        <w:rPr>
-          <w:rFonts w:ascii="Arial" w:hAnsi="Arial"/>
-          <w:sz w:val="22"/>
-        </w:rPr>
-        <w:t>Потом можно добавить tools для Grafana и готовые аналитические функции.</w:t>
+        <w:t>7.11 Создать MCP Server</w:t>
+      </w:r>
+    </w:p>
+    <w:p>
+      <w:r>
+        <w:rPr>
+          <w:rFonts w:ascii="Arial" w:hAnsi="Arial"/>
+          <w:sz w:val="22"/>
+        </w:rPr>
+        <w:t>В текущем проекте MCP server должен публиковать не сырой SQL endpoint, а набор безопасных ClickHouse tools.</w:t>
+      </w:r>
+    </w:p>
+    <w:p>
+      <w:r>
+        <w:rPr>
+          <w:rFonts w:ascii="Arial" w:hAnsi="Arial"/>
+          <w:sz w:val="22"/>
+        </w:rPr>
+        <w:t xml:space="preserve">Причина простая: LibreChat должен отвечать по актуальным данным без догадок. Модель интерпретирует вопрос пользователя, выбирает tool, tool валидирует таблицу и колонки через </w:t>
+      </w:r>
+      <w:r>
+        <w:rPr>
+          <w:rFonts w:ascii="Courier New" w:hAnsi="Courier New"/>
+          <w:color w:val="141414"/>
+          <w:sz w:val="20"/>
+        </w:rPr>
+        <w:t>system.tables</w:t>
+      </w:r>
+      <w:r>
+        <w:rPr>
+          <w:rFonts w:ascii="Arial" w:hAnsi="Arial"/>
+          <w:sz w:val="22"/>
+        </w:rPr>
+        <w:t>/</w:t>
+      </w:r>
+      <w:r>
+        <w:rPr>
+          <w:rFonts w:ascii="Courier New" w:hAnsi="Courier New"/>
+          <w:color w:val="141414"/>
+          <w:sz w:val="20"/>
+        </w:rPr>
+        <w:t>system.columns</w:t>
+      </w:r>
+      <w:r>
+        <w:rPr>
+          <w:rFonts w:ascii="Arial" w:hAnsi="Arial"/>
+          <w:sz w:val="22"/>
+        </w:rPr>
+        <w:t>, выполняет нужное чтение в ClickHouse и возвращает строки модели.</w:t>
+      </w:r>
+    </w:p>
+    <w:p>
+      <w:r>
+        <w:rPr>
+          <w:rFonts w:ascii="Arial" w:hAnsi="Arial"/>
+          <w:sz w:val="22"/>
+        </w:rPr>
+        <w:t>Минимальный набор tools для этого проекта:</w:t>
+      </w:r>
+    </w:p>
+    <w:p>
+      <w:pPr>
+        <w:pStyle w:val="ListBullet"/>
+      </w:pPr>
+      <w:r>
+        <w:rPr>
+          <w:rFonts w:ascii="Courier New" w:hAnsi="Courier New"/>
+          <w:color w:val="141414"/>
+          <w:sz w:val="20"/>
+        </w:rPr>
+        <w:t>describe_analytics_schema</w:t>
+      </w:r>
+      <w:r>
+        <w:rPr>
+          <w:rFonts w:ascii="Arial" w:hAnsi="Arial"/>
+          <w:sz w:val="22"/>
+        </w:rPr>
+        <w:t>;</w:t>
+      </w:r>
+    </w:p>
+    <w:p>
+      <w:pPr>
+        <w:pStyle w:val="ListBullet"/>
+      </w:pPr>
+      <w:r>
+        <w:rPr>
+          <w:rFonts w:ascii="Courier New" w:hAnsi="Courier New"/>
+          <w:color w:val="141414"/>
+          <w:sz w:val="20"/>
+        </w:rPr>
+        <w:t>list_analytics_tables</w:t>
+      </w:r>
+      <w:r>
+        <w:rPr>
+          <w:rFonts w:ascii="Arial" w:hAnsi="Arial"/>
+          <w:sz w:val="22"/>
+        </w:rPr>
+        <w:t>;</w:t>
+      </w:r>
+    </w:p>
+    <w:p>
+      <w:pPr>
+        <w:pStyle w:val="ListBullet"/>
+      </w:pPr>
+      <w:r>
+        <w:rPr>
+          <w:rFonts w:ascii="Courier New" w:hAnsi="Courier New"/>
+          <w:color w:val="141414"/>
+          <w:sz w:val="20"/>
+        </w:rPr>
+        <w:t>list_non_empty_analytics_tables</w:t>
+      </w:r>
+      <w:r>
+        <w:rPr>
+          <w:rFonts w:ascii="Arial" w:hAnsi="Arial"/>
+          <w:sz w:val="22"/>
+        </w:rPr>
+        <w:t>;</w:t>
+      </w:r>
+    </w:p>
+    <w:p>
+      <w:pPr>
+        <w:pStyle w:val="ListBullet"/>
+      </w:pPr>
+      <w:r>
+        <w:rPr>
+          <w:rFonts w:ascii="Courier New" w:hAnsi="Courier New"/>
+          <w:color w:val="141414"/>
+          <w:sz w:val="20"/>
+        </w:rPr>
+        <w:t>describe_analytics_table</w:t>
+      </w:r>
+      <w:r>
+        <w:rPr>
+          <w:rFonts w:ascii="Arial" w:hAnsi="Arial"/>
+          <w:sz w:val="22"/>
+        </w:rPr>
+        <w:t>;</w:t>
+      </w:r>
+    </w:p>
+    <w:p>
+      <w:pPr>
+        <w:pStyle w:val="ListBullet"/>
+      </w:pPr>
+      <w:r>
+        <w:rPr>
+          <w:rFonts w:ascii="Courier New" w:hAnsi="Courier New"/>
+          <w:color w:val="141414"/>
+          <w:sz w:val="20"/>
+        </w:rPr>
+        <w:t>sample_analytics_table</w:t>
+      </w:r>
+      <w:r>
+        <w:rPr>
+          <w:rFonts w:ascii="Arial" w:hAnsi="Arial"/>
+          <w:sz w:val="22"/>
+        </w:rPr>
+        <w:t>;</w:t>
+      </w:r>
+    </w:p>
+    <w:p>
+      <w:pPr>
+        <w:pStyle w:val="ListBullet"/>
+      </w:pPr>
+      <w:r>
+        <w:rPr>
+          <w:rFonts w:ascii="Courier New" w:hAnsi="Courier New"/>
+          <w:color w:val="141414"/>
+          <w:sz w:val="20"/>
+        </w:rPr>
+        <w:t>profile_analytics_table</w:t>
+      </w:r>
+      <w:r>
+        <w:rPr>
+          <w:rFonts w:ascii="Arial" w:hAnsi="Arial"/>
+          <w:sz w:val="22"/>
+        </w:rPr>
+        <w:t>;</w:t>
+      </w:r>
+    </w:p>
+    <w:p>
+      <w:pPr>
+        <w:pStyle w:val="ListBullet"/>
+      </w:pPr>
+      <w:r>
+        <w:rPr>
+          <w:rFonts w:ascii="Courier New" w:hAnsi="Courier New"/>
+          <w:color w:val="141414"/>
+          <w:sz w:val="20"/>
+        </w:rPr>
+        <w:t>distinct_analytics_values</w:t>
+      </w:r>
+      <w:r>
+        <w:rPr>
+          <w:rFonts w:ascii="Arial" w:hAnsi="Arial"/>
+          <w:sz w:val="22"/>
+        </w:rPr>
+        <w:t>;</w:t>
+      </w:r>
+    </w:p>
+    <w:p>
+      <w:pPr>
+        <w:pStyle w:val="ListBullet"/>
+      </w:pPr>
+      <w:r>
+        <w:rPr>
+          <w:rFonts w:ascii="Courier New" w:hAnsi="Courier New"/>
+          <w:color w:val="141414"/>
+          <w:sz w:val="20"/>
+        </w:rPr>
+        <w:t>count_analytics_by</w:t>
+      </w:r>
+      <w:r>
+        <w:rPr>
+          <w:rFonts w:ascii="Arial" w:hAnsi="Arial"/>
+          <w:sz w:val="22"/>
+        </w:rPr>
+        <w:t>.</w:t>
+      </w:r>
+    </w:p>
+    <w:p>
+      <w:r>
+        <w:rPr>
+          <w:rFonts w:ascii="Arial" w:hAnsi="Arial"/>
+          <w:sz w:val="22"/>
+        </w:rPr>
+        <w:t>Дополнительно оставлены purpose-built tools для частых сценариев: Prometheus metrics, application events, route performance, model usage, error trends и Grafana visualization links.</w:t>
+      </w:r>
+    </w:p>
+    <w:p>
+      <w:r>
+        <w:rPr>
+          <w:rFonts w:ascii="Arial" w:hAnsi="Arial"/>
+          <w:sz w:val="22"/>
+        </w:rPr>
+        <w:t xml:space="preserve">Важно: tool вида </w:t>
+      </w:r>
+      <w:r>
+        <w:rPr>
+          <w:rFonts w:ascii="Courier New" w:hAnsi="Courier New"/>
+          <w:color w:val="141414"/>
+          <w:sz w:val="20"/>
+        </w:rPr>
+        <w:t>run_readonly_query</w:t>
+      </w:r>
+      <w:r>
+        <w:rPr>
+          <w:rFonts w:ascii="Arial" w:hAnsi="Arial"/>
+          <w:sz w:val="22"/>
+        </w:rPr>
+        <w:t xml:space="preserve"> не нужен LibreChat. Если дать модели raw SQL tool, она начинает показывать пользователю SQL/JSON и иногда отвечает из истории вместо live-данных. В этой архитектуре SQL остается внутри MCP server, а наружу публикуются понятные операции над таблицами и колонками.</w:t>
+      </w:r>
+    </w:p>
+    <w:p>
+      <w:r>
+        <w:rPr>
+          <w:rFonts w:ascii="Arial" w:hAnsi="Arial"/>
+          <w:sz w:val="22"/>
+        </w:rPr>
+        <w:t>Файлы MCP server в репозитории:</w:t>
       </w:r>
     </w:p>
     <w:p>
@@ -19531,117 +19847,465 @@
           <w:rFonts w:ascii="Courier New" w:hAnsi="Courier New"/>
           <w:sz w:val="17"/>
         </w:rPr>
-        <w:t>cat &gt; mcp-server/package.json &lt;&lt;'EOF'</w:t>
-      </w:r>
-      <w:r>
-        <w:br/>
-      </w:r>
-      <w:r>
-        <w:rPr>
-          <w:rFonts w:ascii="Courier New" w:hAnsi="Courier New"/>
-          <w:sz w:val="17"/>
-        </w:rPr>
-        <w:t>{</w:t>
-      </w:r>
-      <w:r>
-        <w:br/>
-      </w:r>
-      <w:r>
-        <w:rPr>
-          <w:rFonts w:ascii="Courier New" w:hAnsi="Courier New"/>
-          <w:sz w:val="17"/>
-        </w:rPr>
-        <w:t xml:space="preserve">  "name": "mcp-server",</w:t>
-      </w:r>
-      <w:r>
-        <w:br/>
-      </w:r>
-      <w:r>
-        <w:rPr>
-          <w:rFonts w:ascii="Courier New" w:hAnsi="Courier New"/>
-          <w:sz w:val="17"/>
-        </w:rPr>
-        <w:t xml:space="preserve">  "version": "1.0.0",</w:t>
-      </w:r>
-      <w:r>
-        <w:br/>
-      </w:r>
-      <w:r>
-        <w:rPr>
-          <w:rFonts w:ascii="Courier New" w:hAnsi="Courier New"/>
-          <w:sz w:val="17"/>
-        </w:rPr>
-        <w:t xml:space="preserve">  "type": "module",</w:t>
-      </w:r>
-      <w:r>
-        <w:br/>
-      </w:r>
-      <w:r>
-        <w:rPr>
-          <w:rFonts w:ascii="Courier New" w:hAnsi="Courier New"/>
-          <w:sz w:val="17"/>
-        </w:rPr>
-        <w:t xml:space="preserve">  "scripts": {</w:t>
-      </w:r>
-      <w:r>
-        <w:br/>
-      </w:r>
-      <w:r>
-        <w:rPr>
-          <w:rFonts w:ascii="Courier New" w:hAnsi="Courier New"/>
-          <w:sz w:val="17"/>
-        </w:rPr>
-        <w:t xml:space="preserve">    "start": "node src/server.js"</w:t>
-      </w:r>
-      <w:r>
-        <w:br/>
-      </w:r>
-      <w:r>
-        <w:rPr>
-          <w:rFonts w:ascii="Courier New" w:hAnsi="Courier New"/>
-          <w:sz w:val="17"/>
-        </w:rPr>
-        <w:t xml:space="preserve">  },</w:t>
-      </w:r>
-      <w:r>
-        <w:br/>
-      </w:r>
-      <w:r>
-        <w:rPr>
-          <w:rFonts w:ascii="Courier New" w:hAnsi="Courier New"/>
-          <w:sz w:val="17"/>
-        </w:rPr>
-        <w:t xml:space="preserve">  "dependencies": {</w:t>
-      </w:r>
-      <w:r>
-        <w:br/>
-      </w:r>
-      <w:r>
-        <w:rPr>
-          <w:rFonts w:ascii="Courier New" w:hAnsi="Courier New"/>
-          <w:sz w:val="17"/>
-        </w:rPr>
-        <w:t xml:space="preserve">    "@clickhouse/client": "^1.12.1"</w:t>
-      </w:r>
-      <w:r>
-        <w:br/>
-      </w:r>
-      <w:r>
-        <w:rPr>
-          <w:rFonts w:ascii="Courier New" w:hAnsi="Courier New"/>
-          <w:sz w:val="17"/>
-        </w:rPr>
-        <w:t xml:space="preserve">  }</w:t>
-      </w:r>
-      <w:r>
-        <w:br/>
-      </w:r>
-      <w:r>
-        <w:rPr>
-          <w:rFonts w:ascii="Courier New" w:hAnsi="Courier New"/>
-          <w:sz w:val="17"/>
-        </w:rPr>
-        <w:t>}</w:t>
+        <w:t>mcp-server/package.json</w:t>
+      </w:r>
+      <w:r>
+        <w:br/>
+      </w:r>
+      <w:r>
+        <w:rPr>
+          <w:rFonts w:ascii="Courier New" w:hAnsi="Courier New"/>
+          <w:sz w:val="17"/>
+        </w:rPr>
+        <w:t>mcp-server/Dockerfile</w:t>
+      </w:r>
+      <w:r>
+        <w:br/>
+      </w:r>
+      <w:r>
+        <w:rPr>
+          <w:rFonts w:ascii="Courier New" w:hAnsi="Courier New"/>
+          <w:sz w:val="17"/>
+        </w:rPr>
+        <w:t>mcp-server/src/server.js</w:t>
+      </w:r>
+    </w:p>
+    <w:p>
+      <w:r>
+        <w:rPr>
+          <w:rFonts w:ascii="Arial" w:hAnsi="Arial"/>
+          <w:sz w:val="22"/>
+        </w:rPr>
+        <w:t>Проверка синтаксиса:</w:t>
+      </w:r>
+    </w:p>
+    <w:p>
+      <w:pPr>
+        <w:spacing w:before="60" w:after="120"/>
+      </w:pPr>
+      <w:r>
+        <w:rPr>
+          <w:rFonts w:ascii="Courier New" w:hAnsi="Courier New"/>
+          <w:sz w:val="17"/>
+        </w:rPr>
+        <w:t>node --check mcp-server/src/server.js</w:t>
+      </w:r>
+    </w:p>
+    <w:p>
+      <w:r>
+        <w:rPr>
+          <w:rFonts w:ascii="Arial" w:hAnsi="Arial"/>
+          <w:sz w:val="22"/>
+        </w:rPr>
+        <w:t>Пересборка:</w:t>
+      </w:r>
+    </w:p>
+    <w:p>
+      <w:pPr>
+        <w:spacing w:before="60" w:after="120"/>
+      </w:pPr>
+      <w:r>
+        <w:rPr>
+          <w:rFonts w:ascii="Courier New" w:hAnsi="Courier New"/>
+          <w:sz w:val="17"/>
+        </w:rPr>
+        <w:t>docker compose up -d --build mcp-server</w:t>
+      </w:r>
+    </w:p>
+    <w:p>
+      <w:pPr>
+        <w:pStyle w:val="Heading3"/>
+      </w:pPr>
+      <w:r>
+        <w:t>7.12 Создать LibreChat Template</w:t>
+      </w:r>
+    </w:p>
+    <w:p>
+      <w:pPr>
+        <w:spacing w:before="60" w:after="120"/>
+      </w:pPr>
+      <w:r>
+        <w:rPr>
+          <w:rFonts w:ascii="Courier New" w:hAnsi="Courier New"/>
+          <w:sz w:val="17"/>
+        </w:rPr>
+        <w:t>cat &gt; librechat/librechat.yaml.template &lt;&lt;'EOF'</w:t>
+      </w:r>
+      <w:r>
+        <w:br/>
+      </w:r>
+      <w:r>
+        <w:rPr>
+          <w:rFonts w:ascii="Courier New" w:hAnsi="Courier New"/>
+          <w:sz w:val="17"/>
+        </w:rPr>
+        <w:t>version: 1.2.1</w:t>
+      </w:r>
+      <w:r>
+        <w:br/>
+      </w:r>
+      <w:r>
+        <w:rPr>
+          <w:rFonts w:ascii="Courier New" w:hAnsi="Courier New"/>
+          <w:sz w:val="17"/>
+        </w:rPr>
+      </w:r>
+      <w:r>
+        <w:br/>
+      </w:r>
+      <w:r>
+        <w:rPr>
+          <w:rFonts w:ascii="Courier New" w:hAnsi="Courier New"/>
+          <w:sz w:val="17"/>
+        </w:rPr>
+        <w:t>cache: true</w:t>
+      </w:r>
+      <w:r>
+        <w:br/>
+      </w:r>
+      <w:r>
+        <w:rPr>
+          <w:rFonts w:ascii="Courier New" w:hAnsi="Courier New"/>
+          <w:sz w:val="17"/>
+        </w:rPr>
+      </w:r>
+      <w:r>
+        <w:br/>
+      </w:r>
+      <w:r>
+        <w:rPr>
+          <w:rFonts w:ascii="Courier New" w:hAnsi="Courier New"/>
+          <w:sz w:val="17"/>
+        </w:rPr>
+        <w:t>mcpSettings:</w:t>
+      </w:r>
+      <w:r>
+        <w:br/>
+      </w:r>
+      <w:r>
+        <w:rPr>
+          <w:rFonts w:ascii="Courier New" w:hAnsi="Courier New"/>
+          <w:sz w:val="17"/>
+        </w:rPr>
+        <w:t xml:space="preserve">  allowedDomains:</w:t>
+      </w:r>
+      <w:r>
+        <w:br/>
+      </w:r>
+      <w:r>
+        <w:rPr>
+          <w:rFonts w:ascii="Courier New" w:hAnsi="Courier New"/>
+          <w:sz w:val="17"/>
+        </w:rPr>
+        <w:t xml:space="preserve">    - "mcp-server"</w:t>
+      </w:r>
+      <w:r>
+        <w:br/>
+      </w:r>
+      <w:r>
+        <w:rPr>
+          <w:rFonts w:ascii="Courier New" w:hAnsi="Courier New"/>
+          <w:sz w:val="17"/>
+        </w:rPr>
+        <w:t xml:space="preserve">    - "http://mcp-server:3333"</w:t>
+      </w:r>
+      <w:r>
+        <w:br/>
+      </w:r>
+      <w:r>
+        <w:rPr>
+          <w:rFonts w:ascii="Courier New" w:hAnsi="Courier New"/>
+          <w:sz w:val="17"/>
+        </w:rPr>
+      </w:r>
+      <w:r>
+        <w:br/>
+      </w:r>
+      <w:r>
+        <w:rPr>
+          <w:rFonts w:ascii="Courier New" w:hAnsi="Courier New"/>
+          <w:sz w:val="17"/>
+        </w:rPr>
+        <w:t>endpoints:</w:t>
+      </w:r>
+      <w:r>
+        <w:br/>
+      </w:r>
+      <w:r>
+        <w:rPr>
+          <w:rFonts w:ascii="Courier New" w:hAnsi="Courier New"/>
+          <w:sz w:val="17"/>
+        </w:rPr>
+        <w:t xml:space="preserve">  custom:</w:t>
+      </w:r>
+      <w:r>
+        <w:br/>
+      </w:r>
+      <w:r>
+        <w:rPr>
+          <w:rFonts w:ascii="Courier New" w:hAnsi="Courier New"/>
+          <w:sz w:val="17"/>
+        </w:rPr>
+        <w:t xml:space="preserve">    - name: "Local OpenAI-compatible"</w:t>
+      </w:r>
+      <w:r>
+        <w:br/>
+      </w:r>
+      <w:r>
+        <w:rPr>
+          <w:rFonts w:ascii="Courier New" w:hAnsi="Courier New"/>
+          <w:sz w:val="17"/>
+        </w:rPr>
+        <w:t xml:space="preserve">      apiKey: "${AGENT_PROXY_API_KEY}"</w:t>
+      </w:r>
+      <w:r>
+        <w:br/>
+      </w:r>
+      <w:r>
+        <w:rPr>
+          <w:rFonts w:ascii="Courier New" w:hAnsi="Courier New"/>
+          <w:sz w:val="17"/>
+        </w:rPr>
+        <w:t xml:space="preserve">      baseURL: "${AGENT_PROXY_BASE_URL}"</w:t>
+      </w:r>
+      <w:r>
+        <w:br/>
+      </w:r>
+      <w:r>
+        <w:rPr>
+          <w:rFonts w:ascii="Courier New" w:hAnsi="Courier New"/>
+          <w:sz w:val="17"/>
+        </w:rPr>
+        <w:t xml:space="preserve">      models:</w:t>
+      </w:r>
+      <w:r>
+        <w:br/>
+      </w:r>
+      <w:r>
+        <w:rPr>
+          <w:rFonts w:ascii="Courier New" w:hAnsi="Courier New"/>
+          <w:sz w:val="17"/>
+        </w:rPr>
+        <w:t xml:space="preserve">        default:</w:t>
+      </w:r>
+      <w:r>
+        <w:br/>
+      </w:r>
+      <w:r>
+        <w:rPr>
+          <w:rFonts w:ascii="Courier New" w:hAnsi="Courier New"/>
+          <w:sz w:val="17"/>
+        </w:rPr>
+        <w:t>${LIBRECHAT_MODEL_LIST_YAML}</w:t>
+      </w:r>
+      <w:r>
+        <w:br/>
+      </w:r>
+      <w:r>
+        <w:rPr>
+          <w:rFonts w:ascii="Courier New" w:hAnsi="Courier New"/>
+          <w:sz w:val="17"/>
+        </w:rPr>
+        <w:t xml:space="preserve">        fetch: false</w:t>
+      </w:r>
+      <w:r>
+        <w:br/>
+      </w:r>
+      <w:r>
+        <w:rPr>
+          <w:rFonts w:ascii="Courier New" w:hAnsi="Courier New"/>
+          <w:sz w:val="17"/>
+        </w:rPr>
+        <w:t xml:space="preserve">      titleConvo: true</w:t>
+      </w:r>
+      <w:r>
+        <w:br/>
+      </w:r>
+      <w:r>
+        <w:rPr>
+          <w:rFonts w:ascii="Courier New" w:hAnsi="Courier New"/>
+          <w:sz w:val="17"/>
+        </w:rPr>
+        <w:t xml:space="preserve">      titleModel: "${LIBRECHAT_TITLE_MODEL}"</w:t>
+      </w:r>
+      <w:r>
+        <w:br/>
+      </w:r>
+      <w:r>
+        <w:rPr>
+          <w:rFonts w:ascii="Courier New" w:hAnsi="Courier New"/>
+          <w:sz w:val="17"/>
+        </w:rPr>
+        <w:t xml:space="preserve">      summarize: false</w:t>
+      </w:r>
+      <w:r>
+        <w:br/>
+      </w:r>
+      <w:r>
+        <w:rPr>
+          <w:rFonts w:ascii="Courier New" w:hAnsi="Courier New"/>
+          <w:sz w:val="17"/>
+        </w:rPr>
+        <w:t xml:space="preserve">      summaryModel: "${LIBRECHAT_SUMMARY_MODEL}"</w:t>
+      </w:r>
+      <w:r>
+        <w:br/>
+      </w:r>
+      <w:r>
+        <w:rPr>
+          <w:rFonts w:ascii="Courier New" w:hAnsi="Courier New"/>
+          <w:sz w:val="17"/>
+        </w:rPr>
+      </w:r>
+      <w:r>
+        <w:br/>
+      </w:r>
+      <w:r>
+        <w:rPr>
+          <w:rFonts w:ascii="Courier New" w:hAnsi="Courier New"/>
+          <w:sz w:val="17"/>
+        </w:rPr>
+        <w:t>mcpServers:</w:t>
+      </w:r>
+      <w:r>
+        <w:br/>
+      </w:r>
+      <w:r>
+        <w:rPr>
+          <w:rFonts w:ascii="Courier New" w:hAnsi="Courier New"/>
+          <w:sz w:val="17"/>
+        </w:rPr>
+        <w:t xml:space="preserve">  clickhouse-analytics:</w:t>
+      </w:r>
+      <w:r>
+        <w:br/>
+      </w:r>
+      <w:r>
+        <w:rPr>
+          <w:rFonts w:ascii="Courier New" w:hAnsi="Courier New"/>
+          <w:sz w:val="17"/>
+        </w:rPr>
+        <w:t xml:space="preserve">    type: streamable-http</w:t>
+      </w:r>
+      <w:r>
+        <w:br/>
+      </w:r>
+      <w:r>
+        <w:rPr>
+          <w:rFonts w:ascii="Courier New" w:hAnsi="Courier New"/>
+          <w:sz w:val="17"/>
+        </w:rPr>
+        <w:t xml:space="preserve">    url: http://mcp-server:3333/mcp</w:t>
+      </w:r>
+      <w:r>
+        <w:br/>
+      </w:r>
+      <w:r>
+        <w:rPr>
+          <w:rFonts w:ascii="Courier New" w:hAnsi="Courier New"/>
+          <w:sz w:val="17"/>
+        </w:rPr>
+        <w:t xml:space="preserve">    timeout: 60000</w:t>
+      </w:r>
+      <w:r>
+        <w:br/>
+      </w:r>
+      <w:r>
+        <w:rPr>
+          <w:rFonts w:ascii="Courier New" w:hAnsi="Courier New"/>
+          <w:sz w:val="17"/>
+        </w:rPr>
+        <w:t xml:space="preserve">    serverInstructions: |</w:t>
+      </w:r>
+      <w:r>
+        <w:br/>
+      </w:r>
+      <w:r>
+        <w:rPr>
+          <w:rFonts w:ascii="Courier New" w:hAnsi="Courier New"/>
+          <w:sz w:val="17"/>
+        </w:rPr>
+        <w:t xml:space="preserve">      You do have access to ClickHouse through the clickhouse-analytics MCP tools, not by a direct database socket.</w:t>
+      </w:r>
+      <w:r>
+        <w:br/>
+      </w:r>
+      <w:r>
+        <w:rPr>
+          <w:rFonts w:ascii="Courier New" w:hAnsi="Courier New"/>
+          <w:sz w:val="17"/>
+        </w:rPr>
+        <w:t xml:space="preserve">      By default, "ClickHouse data", "project data", and "tables" mean the analytics database only.</w:t>
+      </w:r>
+      <w:r>
+        <w:br/>
+      </w:r>
+      <w:r>
+        <w:rPr>
+          <w:rFonts w:ascii="Courier New" w:hAnsi="Courier New"/>
+          <w:sz w:val="17"/>
+        </w:rPr>
+        <w:t xml:space="preserve">      If the user asks for non-empty tables, always call list_non_empty_analytics_tables live in the current turn.</w:t>
+      </w:r>
+      <w:r>
+        <w:br/>
+      </w:r>
+      <w:r>
+        <w:rPr>
+          <w:rFonts w:ascii="Courier New" w:hAnsi="Courier New"/>
+          <w:sz w:val="17"/>
+        </w:rPr>
+        <w:t xml:space="preserve">      If the user asks what tables or data are available, use list_analytics_tables or describe_analytics_schema before answering.</w:t>
+      </w:r>
+      <w:r>
+        <w:br/>
+      </w:r>
+      <w:r>
+        <w:rPr>
+          <w:rFonts w:ascii="Courier New" w:hAnsi="Courier New"/>
+          <w:sz w:val="17"/>
+        </w:rPr>
+        <w:t xml:space="preserve">      If the user asks what data is inside a specific table, use profile_analytics_table or sample_analytics_table.</w:t>
+      </w:r>
+      <w:r>
+        <w:br/>
+      </w:r>
+      <w:r>
+        <w:rPr>
+          <w:rFonts w:ascii="Courier New" w:hAnsi="Courier New"/>
+          <w:sz w:val="17"/>
+        </w:rPr>
+        <w:t xml:space="preserve">      If the user asks for unique values, use distinct_analytics_values.</w:t>
+      </w:r>
+      <w:r>
+        <w:br/>
+      </w:r>
+      <w:r>
+        <w:rPr>
+          <w:rFonts w:ascii="Courier New" w:hAnsi="Courier New"/>
+          <w:sz w:val="17"/>
+        </w:rPr>
+        <w:t xml:space="preserve">      If the user asks for counts or distributions, use count_analytics_by.</w:t>
+      </w:r>
+      <w:r>
+        <w:br/>
+      </w:r>
+      <w:r>
+        <w:rPr>
+          <w:rFonts w:ascii="Courier New" w:hAnsi="Courier New"/>
+          <w:sz w:val="17"/>
+        </w:rPr>
+        <w:t xml:space="preserve">      Do not write SQL in the answer as if the user should run it. Do not show JSON tool-call payloads to the user.</w:t>
+      </w:r>
+      <w:r>
+        <w:br/>
+      </w:r>
+      <w:r>
+        <w:rPr>
+          <w:rFonts w:ascii="Courier New" w:hAnsi="Courier New"/>
+          <w:sz w:val="17"/>
+        </w:rPr>
+        <w:t xml:space="preserve">      Never invent table names, columns, rows, JSON/tool results, or Prometheus metric tables.</w:t>
       </w:r>
       <w:r>
         <w:br/>
@@ -19653,94 +20317,489 @@
         </w:rPr>
         <w:t>EOF</w:t>
       </w:r>
-      <w:r>
-        <w:br/>
-      </w:r>
-      <w:r>
-        <w:rPr>
-          <w:rFonts w:ascii="Courier New" w:hAnsi="Courier New"/>
-          <w:sz w:val="17"/>
-        </w:rPr>
-      </w:r>
-      <w:r>
-        <w:br/>
-      </w:r>
-      <w:r>
-        <w:rPr>
-          <w:rFonts w:ascii="Courier New" w:hAnsi="Courier New"/>
-          <w:sz w:val="17"/>
-        </w:rPr>
-        <w:t>cat &gt; mcp-server/Dockerfile &lt;&lt;'EOF'</w:t>
-      </w:r>
-      <w:r>
-        <w:br/>
-      </w:r>
-      <w:r>
-        <w:rPr>
-          <w:rFonts w:ascii="Courier New" w:hAnsi="Courier New"/>
-          <w:sz w:val="17"/>
-        </w:rPr>
-        <w:t>FROM node:22-alpine</w:t>
-      </w:r>
-      <w:r>
-        <w:br/>
-      </w:r>
-      <w:r>
-        <w:rPr>
-          <w:rFonts w:ascii="Courier New" w:hAnsi="Courier New"/>
-          <w:sz w:val="17"/>
-        </w:rPr>
-        <w:t>WORKDIR /app</w:t>
-      </w:r>
-      <w:r>
-        <w:br/>
-      </w:r>
-      <w:r>
-        <w:rPr>
-          <w:rFonts w:ascii="Courier New" w:hAnsi="Courier New"/>
-          <w:sz w:val="17"/>
-        </w:rPr>
-        <w:t>COPY package*.json ./</w:t>
-      </w:r>
-      <w:r>
-        <w:br/>
-      </w:r>
-      <w:r>
-        <w:rPr>
-          <w:rFonts w:ascii="Courier New" w:hAnsi="Courier New"/>
-          <w:sz w:val="17"/>
-        </w:rPr>
-        <w:t>RUN npm install</w:t>
-      </w:r>
-      <w:r>
-        <w:br/>
-      </w:r>
-      <w:r>
-        <w:rPr>
-          <w:rFonts w:ascii="Courier New" w:hAnsi="Courier New"/>
-          <w:sz w:val="17"/>
-        </w:rPr>
-        <w:t>COPY src ./src</w:t>
-      </w:r>
-      <w:r>
-        <w:br/>
-      </w:r>
-      <w:r>
-        <w:rPr>
-          <w:rFonts w:ascii="Courier New" w:hAnsi="Courier New"/>
-          <w:sz w:val="17"/>
-        </w:rPr>
-        <w:t>EXPOSE 3333</w:t>
-      </w:r>
-      <w:r>
-        <w:br/>
-      </w:r>
-      <w:r>
-        <w:rPr>
-          <w:rFonts w:ascii="Courier New" w:hAnsi="Courier New"/>
-          <w:sz w:val="17"/>
-        </w:rPr>
-        <w:t>CMD ["npm", "start"]</w:t>
+    </w:p>
+    <w:p>
+      <w:r>
+        <w:rPr>
+          <w:rFonts w:ascii="Arial" w:hAnsi="Arial"/>
+          <w:sz w:val="22"/>
+        </w:rPr>
+        <w:t>Render script:</w:t>
+      </w:r>
+    </w:p>
+    <w:p>
+      <w:pPr>
+        <w:spacing w:before="60" w:after="120"/>
+      </w:pPr>
+      <w:r>
+        <w:rPr>
+          <w:rFonts w:ascii="Courier New" w:hAnsi="Courier New"/>
+          <w:sz w:val="17"/>
+        </w:rPr>
+        <w:t>cat &gt; librechat/render-config.sh &lt;&lt;'EOF'</w:t>
+      </w:r>
+      <w:r>
+        <w:br/>
+      </w:r>
+      <w:r>
+        <w:rPr>
+          <w:rFonts w:ascii="Courier New" w:hAnsi="Courier New"/>
+          <w:sz w:val="17"/>
+        </w:rPr>
+        <w:t>#!/bin/sh</w:t>
+      </w:r>
+      <w:r>
+        <w:br/>
+      </w:r>
+      <w:r>
+        <w:rPr>
+          <w:rFonts w:ascii="Courier New" w:hAnsi="Courier New"/>
+          <w:sz w:val="17"/>
+        </w:rPr>
+        <w:t>set -eu</w:t>
+      </w:r>
+      <w:r>
+        <w:br/>
+      </w:r>
+      <w:r>
+        <w:rPr>
+          <w:rFonts w:ascii="Courier New" w:hAnsi="Courier New"/>
+          <w:sz w:val="17"/>
+        </w:rPr>
+      </w:r>
+      <w:r>
+        <w:br/>
+      </w:r>
+      <w:r>
+        <w:rPr>
+          <w:rFonts w:ascii="Courier New" w:hAnsi="Courier New"/>
+          <w:sz w:val="17"/>
+        </w:rPr>
+        <w:t>models="${LIBRECHAT_MODELS:-${OPENAI_MODEL:-qwen2.5:7b}}"</w:t>
+      </w:r>
+      <w:r>
+        <w:br/>
+      </w:r>
+      <w:r>
+        <w:rPr>
+          <w:rFonts w:ascii="Courier New" w:hAnsi="Courier New"/>
+          <w:sz w:val="17"/>
+        </w:rPr>
+        <w:t>title_model="${LIBRECHAT_TITLE_MODEL:-${OPENAI_MODEL:-$(printf '%s' "$models" | cut -d, -f1)}}"</w:t>
+      </w:r>
+      <w:r>
+        <w:br/>
+      </w:r>
+      <w:r>
+        <w:rPr>
+          <w:rFonts w:ascii="Courier New" w:hAnsi="Courier New"/>
+          <w:sz w:val="17"/>
+        </w:rPr>
+        <w:t>summary_model="${LIBRECHAT_SUMMARY_MODEL:-$title_model}"</w:t>
+      </w:r>
+      <w:r>
+        <w:br/>
+      </w:r>
+      <w:r>
+        <w:rPr>
+          <w:rFonts w:ascii="Courier New" w:hAnsi="Courier New"/>
+          <w:sz w:val="17"/>
+        </w:rPr>
+        <w:t>model_yaml=""</w:t>
+      </w:r>
+      <w:r>
+        <w:br/>
+      </w:r>
+      <w:r>
+        <w:rPr>
+          <w:rFonts w:ascii="Courier New" w:hAnsi="Courier New"/>
+          <w:sz w:val="17"/>
+        </w:rPr>
+      </w:r>
+      <w:r>
+        <w:br/>
+      </w:r>
+      <w:r>
+        <w:rPr>
+          <w:rFonts w:ascii="Courier New" w:hAnsi="Courier New"/>
+          <w:sz w:val="17"/>
+        </w:rPr>
+        <w:t>old_ifs="$IFS"</w:t>
+      </w:r>
+      <w:r>
+        <w:br/>
+      </w:r>
+      <w:r>
+        <w:rPr>
+          <w:rFonts w:ascii="Courier New" w:hAnsi="Courier New"/>
+          <w:sz w:val="17"/>
+        </w:rPr>
+        <w:t>IFS=','</w:t>
+      </w:r>
+      <w:r>
+        <w:br/>
+      </w:r>
+      <w:r>
+        <w:rPr>
+          <w:rFonts w:ascii="Courier New" w:hAnsi="Courier New"/>
+          <w:sz w:val="17"/>
+        </w:rPr>
+        <w:t>for model in $models; do</w:t>
+      </w:r>
+      <w:r>
+        <w:br/>
+      </w:r>
+      <w:r>
+        <w:rPr>
+          <w:rFonts w:ascii="Courier New" w:hAnsi="Courier New"/>
+          <w:sz w:val="17"/>
+        </w:rPr>
+        <w:t xml:space="preserve">  trimmed="$(printf '%s' "$model" | sed 's/^[[:space:]]*//;s/[[:space:]]*$//')"</w:t>
+      </w:r>
+      <w:r>
+        <w:br/>
+      </w:r>
+      <w:r>
+        <w:rPr>
+          <w:rFonts w:ascii="Courier New" w:hAnsi="Courier New"/>
+          <w:sz w:val="17"/>
+        </w:rPr>
+        <w:t xml:space="preserve">  if [ -n "$trimmed" ]; then</w:t>
+      </w:r>
+      <w:r>
+        <w:br/>
+      </w:r>
+      <w:r>
+        <w:rPr>
+          <w:rFonts w:ascii="Courier New" w:hAnsi="Courier New"/>
+          <w:sz w:val="17"/>
+        </w:rPr>
+        <w:t xml:space="preserve">    model_yaml="${model_yaml}          - \"${trimmed}\"</w:t>
+      </w:r>
+      <w:r>
+        <w:br/>
+      </w:r>
+      <w:r>
+        <w:rPr>
+          <w:rFonts w:ascii="Courier New" w:hAnsi="Courier New"/>
+          <w:sz w:val="17"/>
+        </w:rPr>
+        <w:t>"</w:t>
+      </w:r>
+      <w:r>
+        <w:br/>
+      </w:r>
+      <w:r>
+        <w:rPr>
+          <w:rFonts w:ascii="Courier New" w:hAnsi="Courier New"/>
+          <w:sz w:val="17"/>
+        </w:rPr>
+        <w:t xml:space="preserve">  fi</w:t>
+      </w:r>
+      <w:r>
+        <w:br/>
+      </w:r>
+      <w:r>
+        <w:rPr>
+          <w:rFonts w:ascii="Courier New" w:hAnsi="Courier New"/>
+          <w:sz w:val="17"/>
+        </w:rPr>
+        <w:t>done</w:t>
+      </w:r>
+      <w:r>
+        <w:br/>
+      </w:r>
+      <w:r>
+        <w:rPr>
+          <w:rFonts w:ascii="Courier New" w:hAnsi="Courier New"/>
+          <w:sz w:val="17"/>
+        </w:rPr>
+        <w:t>IFS="$old_ifs"</w:t>
+      </w:r>
+      <w:r>
+        <w:br/>
+      </w:r>
+      <w:r>
+        <w:rPr>
+          <w:rFonts w:ascii="Courier New" w:hAnsi="Courier New"/>
+          <w:sz w:val="17"/>
+        </w:rPr>
+      </w:r>
+      <w:r>
+        <w:br/>
+      </w:r>
+      <w:r>
+        <w:rPr>
+          <w:rFonts w:ascii="Courier New" w:hAnsi="Courier New"/>
+          <w:sz w:val="17"/>
+        </w:rPr>
+        <w:t>if [ -z "$model_yaml" ]; then</w:t>
+      </w:r>
+      <w:r>
+        <w:br/>
+      </w:r>
+      <w:r>
+        <w:rPr>
+          <w:rFonts w:ascii="Courier New" w:hAnsi="Courier New"/>
+          <w:sz w:val="17"/>
+        </w:rPr>
+        <w:t xml:space="preserve">  model_yaml='          - "qwen2.5:7b"</w:t>
+      </w:r>
+      <w:r>
+        <w:br/>
+      </w:r>
+      <w:r>
+        <w:rPr>
+          <w:rFonts w:ascii="Courier New" w:hAnsi="Courier New"/>
+          <w:sz w:val="17"/>
+        </w:rPr>
+        <w:t>'</w:t>
+      </w:r>
+      <w:r>
+        <w:br/>
+      </w:r>
+      <w:r>
+        <w:rPr>
+          <w:rFonts w:ascii="Courier New" w:hAnsi="Courier New"/>
+          <w:sz w:val="17"/>
+        </w:rPr>
+        <w:t>fi</w:t>
+      </w:r>
+      <w:r>
+        <w:br/>
+      </w:r>
+      <w:r>
+        <w:rPr>
+          <w:rFonts w:ascii="Courier New" w:hAnsi="Courier New"/>
+          <w:sz w:val="17"/>
+        </w:rPr>
+      </w:r>
+      <w:r>
+        <w:br/>
+      </w:r>
+      <w:r>
+        <w:rPr>
+          <w:rFonts w:ascii="Courier New" w:hAnsi="Courier New"/>
+          <w:sz w:val="17"/>
+        </w:rPr>
+        <w:t>export AGENT_PROXY_API_KEY="${AGENT_PROXY_API_KEY:-local-dev-key}"</w:t>
+      </w:r>
+      <w:r>
+        <w:br/>
+      </w:r>
+      <w:r>
+        <w:rPr>
+          <w:rFonts w:ascii="Courier New" w:hAnsi="Courier New"/>
+          <w:sz w:val="17"/>
+        </w:rPr>
+        <w:t>export AGENT_PROXY_BASE_URL="${AGENT_PROXY_BASE_URL:-http://agent-proxy:3344/v1}"</w:t>
+      </w:r>
+      <w:r>
+        <w:br/>
+      </w:r>
+      <w:r>
+        <w:rPr>
+          <w:rFonts w:ascii="Courier New" w:hAnsi="Courier New"/>
+          <w:sz w:val="17"/>
+        </w:rPr>
+        <w:t>export LIBRECHAT_TITLE_MODEL="$title_model"</w:t>
+      </w:r>
+      <w:r>
+        <w:br/>
+      </w:r>
+      <w:r>
+        <w:rPr>
+          <w:rFonts w:ascii="Courier New" w:hAnsi="Courier New"/>
+          <w:sz w:val="17"/>
+        </w:rPr>
+        <w:t>export LIBRECHAT_SUMMARY_MODEL="$summary_model"</w:t>
+      </w:r>
+      <w:r>
+        <w:br/>
+      </w:r>
+      <w:r>
+        <w:rPr>
+          <w:rFonts w:ascii="Courier New" w:hAnsi="Courier New"/>
+          <w:sz w:val="17"/>
+        </w:rPr>
+        <w:t>export LIBRECHAT_MODEL_LIST_YAML="$model_yaml"</w:t>
+      </w:r>
+      <w:r>
+        <w:br/>
+      </w:r>
+      <w:r>
+        <w:rPr>
+          <w:rFonts w:ascii="Courier New" w:hAnsi="Courier New"/>
+          <w:sz w:val="17"/>
+        </w:rPr>
+      </w:r>
+      <w:r>
+        <w:br/>
+      </w:r>
+      <w:r>
+        <w:rPr>
+          <w:rFonts w:ascii="Courier New" w:hAnsi="Courier New"/>
+          <w:sz w:val="17"/>
+        </w:rPr>
+        <w:t>python3 - &lt;&lt;'PY'</w:t>
+      </w:r>
+      <w:r>
+        <w:br/>
+      </w:r>
+      <w:r>
+        <w:rPr>
+          <w:rFonts w:ascii="Courier New" w:hAnsi="Courier New"/>
+          <w:sz w:val="17"/>
+        </w:rPr>
+        <w:t>from pathlib import Path</w:t>
+      </w:r>
+      <w:r>
+        <w:br/>
+      </w:r>
+      <w:r>
+        <w:rPr>
+          <w:rFonts w:ascii="Courier New" w:hAnsi="Courier New"/>
+          <w:sz w:val="17"/>
+        </w:rPr>
+        <w:t>import os</w:t>
+      </w:r>
+      <w:r>
+        <w:br/>
+      </w:r>
+      <w:r>
+        <w:rPr>
+          <w:rFonts w:ascii="Courier New" w:hAnsi="Courier New"/>
+          <w:sz w:val="17"/>
+        </w:rPr>
+      </w:r>
+      <w:r>
+        <w:br/>
+      </w:r>
+      <w:r>
+        <w:rPr>
+          <w:rFonts w:ascii="Courier New" w:hAnsi="Courier New"/>
+          <w:sz w:val="17"/>
+        </w:rPr>
+        <w:t>template = Path('/app/librechat.yaml.template').read_text()</w:t>
+      </w:r>
+      <w:r>
+        <w:br/>
+      </w:r>
+      <w:r>
+        <w:rPr>
+          <w:rFonts w:ascii="Courier New" w:hAnsi="Courier New"/>
+          <w:sz w:val="17"/>
+        </w:rPr>
+        <w:t>for key in [</w:t>
+      </w:r>
+      <w:r>
+        <w:br/>
+      </w:r>
+      <w:r>
+        <w:rPr>
+          <w:rFonts w:ascii="Courier New" w:hAnsi="Courier New"/>
+          <w:sz w:val="17"/>
+        </w:rPr>
+        <w:t xml:space="preserve">    'AGENT_PROXY_API_KEY',</w:t>
+      </w:r>
+      <w:r>
+        <w:br/>
+      </w:r>
+      <w:r>
+        <w:rPr>
+          <w:rFonts w:ascii="Courier New" w:hAnsi="Courier New"/>
+          <w:sz w:val="17"/>
+        </w:rPr>
+        <w:t xml:space="preserve">    'AGENT_PROXY_BASE_URL',</w:t>
+      </w:r>
+      <w:r>
+        <w:br/>
+      </w:r>
+      <w:r>
+        <w:rPr>
+          <w:rFonts w:ascii="Courier New" w:hAnsi="Courier New"/>
+          <w:sz w:val="17"/>
+        </w:rPr>
+        <w:t xml:space="preserve">    'LIBRECHAT_TITLE_MODEL',</w:t>
+      </w:r>
+      <w:r>
+        <w:br/>
+      </w:r>
+      <w:r>
+        <w:rPr>
+          <w:rFonts w:ascii="Courier New" w:hAnsi="Courier New"/>
+          <w:sz w:val="17"/>
+        </w:rPr>
+        <w:t xml:space="preserve">    'LIBRECHAT_SUMMARY_MODEL',</w:t>
+      </w:r>
+      <w:r>
+        <w:br/>
+      </w:r>
+      <w:r>
+        <w:rPr>
+          <w:rFonts w:ascii="Courier New" w:hAnsi="Courier New"/>
+          <w:sz w:val="17"/>
+        </w:rPr>
+        <w:t xml:space="preserve">    'LIBRECHAT_MODEL_LIST_YAML',</w:t>
+      </w:r>
+      <w:r>
+        <w:br/>
+      </w:r>
+      <w:r>
+        <w:rPr>
+          <w:rFonts w:ascii="Courier New" w:hAnsi="Courier New"/>
+          <w:sz w:val="17"/>
+        </w:rPr>
+        <w:t>]:</w:t>
+      </w:r>
+      <w:r>
+        <w:br/>
+      </w:r>
+      <w:r>
+        <w:rPr>
+          <w:rFonts w:ascii="Courier New" w:hAnsi="Courier New"/>
+          <w:sz w:val="17"/>
+        </w:rPr>
+        <w:t xml:space="preserve">    template = template.replace('${' + key + '}', os.environ.get(key, ''))</w:t>
+      </w:r>
+      <w:r>
+        <w:br/>
+      </w:r>
+      <w:r>
+        <w:rPr>
+          <w:rFonts w:ascii="Courier New" w:hAnsi="Courier New"/>
+          <w:sz w:val="17"/>
+        </w:rPr>
+        <w:t>Path('/app/librechat.yaml').write_text(template)</w:t>
+      </w:r>
+      <w:r>
+        <w:br/>
+      </w:r>
+      <w:r>
+        <w:rPr>
+          <w:rFonts w:ascii="Courier New" w:hAnsi="Courier New"/>
+          <w:sz w:val="17"/>
+        </w:rPr>
+        <w:t>PY</w:t>
+      </w:r>
+      <w:r>
+        <w:br/>
+      </w:r>
+      <w:r>
+        <w:rPr>
+          <w:rFonts w:ascii="Courier New" w:hAnsi="Courier New"/>
+          <w:sz w:val="17"/>
+        </w:rPr>
+      </w:r>
+      <w:r>
+        <w:br/>
+      </w:r>
+      <w:r>
+        <w:rPr>
+          <w:rFonts w:ascii="Courier New" w:hAnsi="Courier New"/>
+          <w:sz w:val="17"/>
+        </w:rPr>
+        <w:t>exec npm run backend</w:t>
       </w:r>
       <w:r>
         <w:br/>
@@ -19752,436 +20811,14 @@
         </w:rPr>
         <w:t>EOF</w:t>
       </w:r>
-      <w:r>
-        <w:br/>
-      </w:r>
-      <w:r>
-        <w:rPr>
-          <w:rFonts w:ascii="Courier New" w:hAnsi="Courier New"/>
-          <w:sz w:val="17"/>
-        </w:rPr>
-      </w:r>
-      <w:r>
-        <w:br/>
-      </w:r>
-      <w:r>
-        <w:rPr>
-          <w:rFonts w:ascii="Courier New" w:hAnsi="Courier New"/>
-          <w:sz w:val="17"/>
-        </w:rPr>
-        <w:t>cat &gt; mcp-server/src/server.js &lt;&lt;'EOF'</w:t>
-      </w:r>
-      <w:r>
-        <w:br/>
-      </w:r>
-      <w:r>
-        <w:rPr>
-          <w:rFonts w:ascii="Courier New" w:hAnsi="Courier New"/>
-          <w:sz w:val="17"/>
-        </w:rPr>
-        <w:t>import http from 'node:http';</w:t>
-      </w:r>
-      <w:r>
-        <w:br/>
-      </w:r>
-      <w:r>
-        <w:rPr>
-          <w:rFonts w:ascii="Courier New" w:hAnsi="Courier New"/>
-          <w:sz w:val="17"/>
-        </w:rPr>
-        <w:t>import { createClient } from '@clickhouse/client';</w:t>
-      </w:r>
-      <w:r>
-        <w:br/>
-      </w:r>
-      <w:r>
-        <w:rPr>
-          <w:rFonts w:ascii="Courier New" w:hAnsi="Courier New"/>
-          <w:sz w:val="17"/>
-        </w:rPr>
-      </w:r>
-      <w:r>
-        <w:br/>
-      </w:r>
-      <w:r>
-        <w:rPr>
-          <w:rFonts w:ascii="Courier New" w:hAnsi="Courier New"/>
-          <w:sz w:val="17"/>
-        </w:rPr>
-        <w:t>const port = Number(process.env.PORT || 3333);</w:t>
-      </w:r>
-      <w:r>
-        <w:br/>
-      </w:r>
-      <w:r>
-        <w:rPr>
-          <w:rFonts w:ascii="Courier New" w:hAnsi="Courier New"/>
-          <w:sz w:val="17"/>
-        </w:rPr>
-        <w:t>const clickhouse = createClient({</w:t>
-      </w:r>
-      <w:r>
-        <w:br/>
-      </w:r>
-      <w:r>
-        <w:rPr>
-          <w:rFonts w:ascii="Courier New" w:hAnsi="Courier New"/>
-          <w:sz w:val="17"/>
-        </w:rPr>
-        <w:t xml:space="preserve">  url: process.env.CLICKHOUSE_HOST || 'http://clickhouse:8123',</w:t>
-      </w:r>
-      <w:r>
-        <w:br/>
-      </w:r>
-      <w:r>
-        <w:rPr>
-          <w:rFonts w:ascii="Courier New" w:hAnsi="Courier New"/>
-          <w:sz w:val="17"/>
-        </w:rPr>
-        <w:t xml:space="preserve">  username: process.env.CLICKHOUSE_USER || 'analytics',</w:t>
-      </w:r>
-      <w:r>
-        <w:br/>
-      </w:r>
-      <w:r>
-        <w:rPr>
-          <w:rFonts w:ascii="Courier New" w:hAnsi="Courier New"/>
-          <w:sz w:val="17"/>
-        </w:rPr>
-        <w:t xml:space="preserve">  password: process.env.CLICKHOUSE_PASSWORD || 'analytics_password',</w:t>
-      </w:r>
-      <w:r>
-        <w:br/>
-      </w:r>
-      <w:r>
-        <w:rPr>
-          <w:rFonts w:ascii="Courier New" w:hAnsi="Courier New"/>
-          <w:sz w:val="17"/>
-        </w:rPr>
-        <w:t xml:space="preserve">  database: process.env.CLICKHOUSE_DATABASE || 'analytics',</w:t>
-      </w:r>
-      <w:r>
-        <w:br/>
-      </w:r>
-      <w:r>
-        <w:rPr>
-          <w:rFonts w:ascii="Courier New" w:hAnsi="Courier New"/>
-          <w:sz w:val="17"/>
-        </w:rPr>
-        <w:t>});</w:t>
-      </w:r>
-      <w:r>
-        <w:br/>
-      </w:r>
-      <w:r>
-        <w:rPr>
-          <w:rFonts w:ascii="Courier New" w:hAnsi="Courier New"/>
-          <w:sz w:val="17"/>
-        </w:rPr>
-      </w:r>
-      <w:r>
-        <w:br/>
-      </w:r>
-      <w:r>
-        <w:rPr>
-          <w:rFonts w:ascii="Courier New" w:hAnsi="Courier New"/>
-          <w:sz w:val="17"/>
-        </w:rPr>
-        <w:t>function sendJson(res, status, data) {</w:t>
-      </w:r>
-      <w:r>
-        <w:br/>
-      </w:r>
-      <w:r>
-        <w:rPr>
-          <w:rFonts w:ascii="Courier New" w:hAnsi="Courier New"/>
-          <w:sz w:val="17"/>
-        </w:rPr>
-        <w:t xml:space="preserve">  res.writeHead(status, { 'Content-Type': 'application/json' });</w:t>
-      </w:r>
-      <w:r>
-        <w:br/>
-      </w:r>
-      <w:r>
-        <w:rPr>
-          <w:rFonts w:ascii="Courier New" w:hAnsi="Courier New"/>
-          <w:sz w:val="17"/>
-        </w:rPr>
-        <w:t xml:space="preserve">  res.end(JSON.stringify(data));</w:t>
-      </w:r>
-      <w:r>
-        <w:br/>
-      </w:r>
-      <w:r>
-        <w:rPr>
-          <w:rFonts w:ascii="Courier New" w:hAnsi="Courier New"/>
-          <w:sz w:val="17"/>
-        </w:rPr>
-        <w:t>}</w:t>
-      </w:r>
-      <w:r>
-        <w:br/>
-      </w:r>
-      <w:r>
-        <w:rPr>
-          <w:rFonts w:ascii="Courier New" w:hAnsi="Courier New"/>
-          <w:sz w:val="17"/>
-        </w:rPr>
-      </w:r>
-      <w:r>
-        <w:br/>
-      </w:r>
-      <w:r>
-        <w:rPr>
-          <w:rFonts w:ascii="Courier New" w:hAnsi="Courier New"/>
-          <w:sz w:val="17"/>
-        </w:rPr>
-        <w:t>function isSafeSelect(query) {</w:t>
-      </w:r>
-      <w:r>
-        <w:br/>
-      </w:r>
-      <w:r>
-        <w:rPr>
-          <w:rFonts w:ascii="Courier New" w:hAnsi="Courier New"/>
-          <w:sz w:val="17"/>
-        </w:rPr>
-        <w:t xml:space="preserve">  return /^\s*select\b/i.test(query) &amp;&amp; !/;\s*\S/.test(query);</w:t>
-      </w:r>
-      <w:r>
-        <w:br/>
-      </w:r>
-      <w:r>
-        <w:rPr>
-          <w:rFonts w:ascii="Courier New" w:hAnsi="Courier New"/>
-          <w:sz w:val="17"/>
-        </w:rPr>
-        <w:t>}</w:t>
-      </w:r>
-      <w:r>
-        <w:br/>
-      </w:r>
-      <w:r>
-        <w:rPr>
-          <w:rFonts w:ascii="Courier New" w:hAnsi="Courier New"/>
-          <w:sz w:val="17"/>
-        </w:rPr>
-      </w:r>
-      <w:r>
-        <w:br/>
-      </w:r>
-      <w:r>
-        <w:rPr>
-          <w:rFonts w:ascii="Courier New" w:hAnsi="Courier New"/>
-          <w:sz w:val="17"/>
-        </w:rPr>
-        <w:t>http.createServer(async (req, res) =&gt; {</w:t>
-      </w:r>
-      <w:r>
-        <w:br/>
-      </w:r>
-      <w:r>
-        <w:rPr>
-          <w:rFonts w:ascii="Courier New" w:hAnsi="Courier New"/>
-          <w:sz w:val="17"/>
-        </w:rPr>
-        <w:t xml:space="preserve">  try {</w:t>
-      </w:r>
-      <w:r>
-        <w:br/>
-      </w:r>
-      <w:r>
-        <w:rPr>
-          <w:rFonts w:ascii="Courier New" w:hAnsi="Courier New"/>
-          <w:sz w:val="17"/>
-        </w:rPr>
-        <w:t xml:space="preserve">    if (req.method === 'GET' &amp;&amp; req.url === '/health') {</w:t>
-      </w:r>
-      <w:r>
-        <w:br/>
-      </w:r>
-      <w:r>
-        <w:rPr>
-          <w:rFonts w:ascii="Courier New" w:hAnsi="Courier New"/>
-          <w:sz w:val="17"/>
-        </w:rPr>
-        <w:t xml:space="preserve">      return sendJson(res, 200, { ok: true });</w:t>
-      </w:r>
-      <w:r>
-        <w:br/>
-      </w:r>
-      <w:r>
-        <w:rPr>
-          <w:rFonts w:ascii="Courier New" w:hAnsi="Courier New"/>
-          <w:sz w:val="17"/>
-        </w:rPr>
-        <w:t xml:space="preserve">    }</w:t>
-      </w:r>
-      <w:r>
-        <w:br/>
-      </w:r>
-      <w:r>
-        <w:rPr>
-          <w:rFonts w:ascii="Courier New" w:hAnsi="Courier New"/>
-          <w:sz w:val="17"/>
-        </w:rPr>
-        <w:t xml:space="preserve">    if (req.method === 'POST' &amp;&amp; req.url === '/query') {</w:t>
-      </w:r>
-      <w:r>
-        <w:br/>
-      </w:r>
-      <w:r>
-        <w:rPr>
-          <w:rFonts w:ascii="Courier New" w:hAnsi="Courier New"/>
-          <w:sz w:val="17"/>
-        </w:rPr>
-        <w:t xml:space="preserve">      const chunks = [];</w:t>
-      </w:r>
-      <w:r>
-        <w:br/>
-      </w:r>
-      <w:r>
-        <w:rPr>
-          <w:rFonts w:ascii="Courier New" w:hAnsi="Courier New"/>
-          <w:sz w:val="17"/>
-        </w:rPr>
-        <w:t xml:space="preserve">      for await (const chunk of req) chunks.push(chunk);</w:t>
-      </w:r>
-      <w:r>
-        <w:br/>
-      </w:r>
-      <w:r>
-        <w:rPr>
-          <w:rFonts w:ascii="Courier New" w:hAnsi="Courier New"/>
-          <w:sz w:val="17"/>
-        </w:rPr>
-        <w:t xml:space="preserve">      const { query } = JSON.parse(Buffer.concat(chunks).toString('utf8'));</w:t>
-      </w:r>
-      <w:r>
-        <w:br/>
-      </w:r>
-      <w:r>
-        <w:rPr>
-          <w:rFonts w:ascii="Courier New" w:hAnsi="Courier New"/>
-          <w:sz w:val="17"/>
-        </w:rPr>
-        <w:t xml:space="preserve">      if (!isSafeSelect(query)) return sendJson(res, 400, { error: 'Only single SELECT queries are allowed' });</w:t>
-      </w:r>
-      <w:r>
-        <w:br/>
-      </w:r>
-      <w:r>
-        <w:rPr>
-          <w:rFonts w:ascii="Courier New" w:hAnsi="Courier New"/>
-          <w:sz w:val="17"/>
-        </w:rPr>
-        <w:t xml:space="preserve">      const result = await clickhouse.query({ query, format: 'JSONEachRow' });</w:t>
-      </w:r>
-      <w:r>
-        <w:br/>
-      </w:r>
-      <w:r>
-        <w:rPr>
-          <w:rFonts w:ascii="Courier New" w:hAnsi="Courier New"/>
-          <w:sz w:val="17"/>
-        </w:rPr>
-        <w:t xml:space="preserve">      return sendJson(res, 200, await result.json());</w:t>
-      </w:r>
-      <w:r>
-        <w:br/>
-      </w:r>
-      <w:r>
-        <w:rPr>
-          <w:rFonts w:ascii="Courier New" w:hAnsi="Courier New"/>
-          <w:sz w:val="17"/>
-        </w:rPr>
-        <w:t xml:space="preserve">    }</w:t>
-      </w:r>
-      <w:r>
-        <w:br/>
-      </w:r>
-      <w:r>
-        <w:rPr>
-          <w:rFonts w:ascii="Courier New" w:hAnsi="Courier New"/>
-          <w:sz w:val="17"/>
-        </w:rPr>
-        <w:t xml:space="preserve">    sendJson(res, 404, { error: 'Not found' });</w:t>
-      </w:r>
-      <w:r>
-        <w:br/>
-      </w:r>
-      <w:r>
-        <w:rPr>
-          <w:rFonts w:ascii="Courier New" w:hAnsi="Courier New"/>
-          <w:sz w:val="17"/>
-        </w:rPr>
-        <w:t xml:space="preserve">  } catch (error) {</w:t>
-      </w:r>
-      <w:r>
-        <w:br/>
-      </w:r>
-      <w:r>
-        <w:rPr>
-          <w:rFonts w:ascii="Courier New" w:hAnsi="Courier New"/>
-          <w:sz w:val="17"/>
-        </w:rPr>
-        <w:t xml:space="preserve">    sendJson(res, 500, { error: error.message });</w:t>
-      </w:r>
-      <w:r>
-        <w:br/>
-      </w:r>
-      <w:r>
-        <w:rPr>
-          <w:rFonts w:ascii="Courier New" w:hAnsi="Courier New"/>
-          <w:sz w:val="17"/>
-        </w:rPr>
-        <w:t xml:space="preserve">  }</w:t>
-      </w:r>
-      <w:r>
-        <w:br/>
-      </w:r>
-      <w:r>
-        <w:rPr>
-          <w:rFonts w:ascii="Courier New" w:hAnsi="Courier New"/>
-          <w:sz w:val="17"/>
-        </w:rPr>
-        <w:t>}).listen(port, '0.0.0.0');</w:t>
-      </w:r>
-      <w:r>
-        <w:br/>
-      </w:r>
-      <w:r>
-        <w:rPr>
-          <w:rFonts w:ascii="Courier New" w:hAnsi="Courier New"/>
-          <w:sz w:val="17"/>
-        </w:rPr>
-        <w:t>EOF</w:t>
-      </w:r>
-    </w:p>
-    <w:p>
-      <w:r>
-        <w:rPr>
-          <w:rFonts w:ascii="Arial" w:hAnsi="Arial"/>
-          <w:sz w:val="22"/>
-        </w:rPr>
-        <w:t>Важно: эта минимальная версия не является полной MCP streamable-http реализацией.</w:t>
-      </w:r>
-    </w:p>
-    <w:p>
-      <w:r>
-        <w:rPr>
-          <w:rFonts w:ascii="Arial" w:hAnsi="Arial"/>
-          <w:sz w:val="22"/>
-        </w:rPr>
-        <w:t>Для production нужно расширить ее до полного MCP protocol и добавить tools под нужные сценарии аналитики.</w:t>
-      </w:r>
-    </w:p>
-    <w:p>
-      <w:pPr>
-        <w:pStyle w:val="Heading3"/>
-      </w:pPr>
-      <w:r>
-        <w:t>7.12 Создать LibreChat Template</w:t>
+    </w:p>
+    <w:p>
+      <w:r>
+        <w:rPr>
+          <w:rFonts w:ascii="Arial" w:hAnsi="Arial"/>
+          <w:sz w:val="22"/>
+        </w:rPr>
+        <w:t>Добавить новую Ollama-модель в LibreChat:</w:t>
       </w:r>
     </w:p>
     <w:p>
@@ -20193,302 +20830,31 @@
           <w:rFonts w:ascii="Courier New" w:hAnsi="Courier New"/>
           <w:sz w:val="17"/>
         </w:rPr>
-        <w:t>cat &gt; librechat/librechat.yaml.template &lt;&lt;'EOF'</w:t>
-      </w:r>
-      <w:r>
-        <w:br/>
-      </w:r>
-      <w:r>
-        <w:rPr>
-          <w:rFonts w:ascii="Courier New" w:hAnsi="Courier New"/>
-          <w:sz w:val="17"/>
-        </w:rPr>
-        <w:t>version: 1.2.1</w:t>
-      </w:r>
-      <w:r>
-        <w:br/>
-      </w:r>
-      <w:r>
-        <w:rPr>
-          <w:rFonts w:ascii="Courier New" w:hAnsi="Courier New"/>
-          <w:sz w:val="17"/>
-        </w:rPr>
-      </w:r>
-      <w:r>
-        <w:br/>
-      </w:r>
-      <w:r>
-        <w:rPr>
-          <w:rFonts w:ascii="Courier New" w:hAnsi="Courier New"/>
-          <w:sz w:val="17"/>
-        </w:rPr>
-        <w:t>cache: true</w:t>
-      </w:r>
-      <w:r>
-        <w:br/>
-      </w:r>
-      <w:r>
-        <w:rPr>
-          <w:rFonts w:ascii="Courier New" w:hAnsi="Courier New"/>
-          <w:sz w:val="17"/>
-        </w:rPr>
-      </w:r>
-      <w:r>
-        <w:br/>
-      </w:r>
-      <w:r>
-        <w:rPr>
-          <w:rFonts w:ascii="Courier New" w:hAnsi="Courier New"/>
-          <w:sz w:val="17"/>
-        </w:rPr>
-        <w:t>mcpSettings:</w:t>
-      </w:r>
-      <w:r>
-        <w:br/>
-      </w:r>
-      <w:r>
-        <w:rPr>
-          <w:rFonts w:ascii="Courier New" w:hAnsi="Courier New"/>
-          <w:sz w:val="17"/>
-        </w:rPr>
-        <w:t xml:space="preserve">  allowedDomains:</w:t>
-      </w:r>
-      <w:r>
-        <w:br/>
-      </w:r>
-      <w:r>
-        <w:rPr>
-          <w:rFonts w:ascii="Courier New" w:hAnsi="Courier New"/>
-          <w:sz w:val="17"/>
-        </w:rPr>
-        <w:t xml:space="preserve">    - "mcp-server"</w:t>
-      </w:r>
-      <w:r>
-        <w:br/>
-      </w:r>
-      <w:r>
-        <w:rPr>
-          <w:rFonts w:ascii="Courier New" w:hAnsi="Courier New"/>
-          <w:sz w:val="17"/>
-        </w:rPr>
-        <w:t xml:space="preserve">    - "http://mcp-server:3333"</w:t>
-      </w:r>
-      <w:r>
-        <w:br/>
-      </w:r>
-      <w:r>
-        <w:rPr>
-          <w:rFonts w:ascii="Courier New" w:hAnsi="Courier New"/>
-          <w:sz w:val="17"/>
-        </w:rPr>
-      </w:r>
-      <w:r>
-        <w:br/>
-      </w:r>
-      <w:r>
-        <w:rPr>
-          <w:rFonts w:ascii="Courier New" w:hAnsi="Courier New"/>
-          <w:sz w:val="17"/>
-        </w:rPr>
-        <w:t>endpoints:</w:t>
-      </w:r>
-      <w:r>
-        <w:br/>
-      </w:r>
-      <w:r>
-        <w:rPr>
-          <w:rFonts w:ascii="Courier New" w:hAnsi="Courier New"/>
-          <w:sz w:val="17"/>
-        </w:rPr>
-        <w:t xml:space="preserve">  custom:</w:t>
-      </w:r>
-      <w:r>
-        <w:br/>
-      </w:r>
-      <w:r>
-        <w:rPr>
-          <w:rFonts w:ascii="Courier New" w:hAnsi="Courier New"/>
-          <w:sz w:val="17"/>
-        </w:rPr>
-        <w:t xml:space="preserve">    - name: "Local OpenAI-compatible"</w:t>
-      </w:r>
-      <w:r>
-        <w:br/>
-      </w:r>
-      <w:r>
-        <w:rPr>
-          <w:rFonts w:ascii="Courier New" w:hAnsi="Courier New"/>
-          <w:sz w:val="17"/>
-        </w:rPr>
-        <w:t xml:space="preserve">      apiKey: "${AGENT_PROXY_API_KEY}"</w:t>
-      </w:r>
-      <w:r>
-        <w:br/>
-      </w:r>
-      <w:r>
-        <w:rPr>
-          <w:rFonts w:ascii="Courier New" w:hAnsi="Courier New"/>
-          <w:sz w:val="17"/>
-        </w:rPr>
-        <w:t xml:space="preserve">      baseURL: "${AGENT_PROXY_BASE_URL}"</w:t>
-      </w:r>
-      <w:r>
-        <w:br/>
-      </w:r>
-      <w:r>
-        <w:rPr>
-          <w:rFonts w:ascii="Courier New" w:hAnsi="Courier New"/>
-          <w:sz w:val="17"/>
-        </w:rPr>
-        <w:t xml:space="preserve">      models:</w:t>
-      </w:r>
-      <w:r>
-        <w:br/>
-      </w:r>
-      <w:r>
-        <w:rPr>
-          <w:rFonts w:ascii="Courier New" w:hAnsi="Courier New"/>
-          <w:sz w:val="17"/>
-        </w:rPr>
-        <w:t xml:space="preserve">        default:</w:t>
-      </w:r>
-      <w:r>
-        <w:br/>
-      </w:r>
-      <w:r>
-        <w:rPr>
-          <w:rFonts w:ascii="Courier New" w:hAnsi="Courier New"/>
-          <w:sz w:val="17"/>
-        </w:rPr>
-        <w:t>${LIBRECHAT_MODEL_LIST_YAML}</w:t>
-      </w:r>
-      <w:r>
-        <w:br/>
-      </w:r>
-      <w:r>
-        <w:rPr>
-          <w:rFonts w:ascii="Courier New" w:hAnsi="Courier New"/>
-          <w:sz w:val="17"/>
-        </w:rPr>
-        <w:t xml:space="preserve">        fetch: false</w:t>
-      </w:r>
-      <w:r>
-        <w:br/>
-      </w:r>
-      <w:r>
-        <w:rPr>
-          <w:rFonts w:ascii="Courier New" w:hAnsi="Courier New"/>
-          <w:sz w:val="17"/>
-        </w:rPr>
-        <w:t xml:space="preserve">      titleConvo: true</w:t>
-      </w:r>
-      <w:r>
-        <w:br/>
-      </w:r>
-      <w:r>
-        <w:rPr>
-          <w:rFonts w:ascii="Courier New" w:hAnsi="Courier New"/>
-          <w:sz w:val="17"/>
-        </w:rPr>
-        <w:t xml:space="preserve">      titleModel: "${LIBRECHAT_TITLE_MODEL}"</w:t>
-      </w:r>
-      <w:r>
-        <w:br/>
-      </w:r>
-      <w:r>
-        <w:rPr>
-          <w:rFonts w:ascii="Courier New" w:hAnsi="Courier New"/>
-          <w:sz w:val="17"/>
-        </w:rPr>
-        <w:t xml:space="preserve">      summarize: false</w:t>
-      </w:r>
-      <w:r>
-        <w:br/>
-      </w:r>
-      <w:r>
-        <w:rPr>
-          <w:rFonts w:ascii="Courier New" w:hAnsi="Courier New"/>
-          <w:sz w:val="17"/>
-        </w:rPr>
-        <w:t xml:space="preserve">      summaryModel: "${LIBRECHAT_SUMMARY_MODEL}"</w:t>
-      </w:r>
-      <w:r>
-        <w:br/>
-      </w:r>
-      <w:r>
-        <w:rPr>
-          <w:rFonts w:ascii="Courier New" w:hAnsi="Courier New"/>
-          <w:sz w:val="17"/>
-        </w:rPr>
-      </w:r>
-      <w:r>
-        <w:br/>
-      </w:r>
-      <w:r>
-        <w:rPr>
-          <w:rFonts w:ascii="Courier New" w:hAnsi="Courier New"/>
-          <w:sz w:val="17"/>
-        </w:rPr>
-        <w:t>mcpServers:</w:t>
-      </w:r>
-      <w:r>
-        <w:br/>
-      </w:r>
-      <w:r>
-        <w:rPr>
-          <w:rFonts w:ascii="Courier New" w:hAnsi="Courier New"/>
-          <w:sz w:val="17"/>
-        </w:rPr>
-        <w:t xml:space="preserve">  clickhouse-analytics:</w:t>
-      </w:r>
-      <w:r>
-        <w:br/>
-      </w:r>
-      <w:r>
-        <w:rPr>
-          <w:rFonts w:ascii="Courier New" w:hAnsi="Courier New"/>
-          <w:sz w:val="17"/>
-        </w:rPr>
-        <w:t xml:space="preserve">    type: streamable-http</w:t>
-      </w:r>
-      <w:r>
-        <w:br/>
-      </w:r>
-      <w:r>
-        <w:rPr>
-          <w:rFonts w:ascii="Courier New" w:hAnsi="Courier New"/>
-          <w:sz w:val="17"/>
-        </w:rPr>
-        <w:t xml:space="preserve">    url: http://mcp-server:3333/mcp</w:t>
-      </w:r>
-      <w:r>
-        <w:br/>
-      </w:r>
-      <w:r>
-        <w:rPr>
-          <w:rFonts w:ascii="Courier New" w:hAnsi="Courier New"/>
-          <w:sz w:val="17"/>
-        </w:rPr>
-        <w:t xml:space="preserve">    timeout: 60000</w:t>
-      </w:r>
-      <w:r>
-        <w:br/>
-      </w:r>
-      <w:r>
-        <w:rPr>
-          <w:rFonts w:ascii="Courier New" w:hAnsi="Courier New"/>
-          <w:sz w:val="17"/>
-        </w:rPr>
-        <w:t>EOF</w:t>
-      </w:r>
-    </w:p>
-    <w:p>
-      <w:r>
-        <w:rPr>
-          <w:rFonts w:ascii="Arial" w:hAnsi="Arial"/>
-          <w:sz w:val="22"/>
-        </w:rPr>
-        <w:t>Render script:</w:t>
+        <w:t>ollama pull qwen3:14b</w:t>
+      </w:r>
+    </w:p>
+    <w:p>
+      <w:r>
+        <w:rPr>
+          <w:rFonts w:ascii="Arial" w:hAnsi="Arial"/>
+          <w:sz w:val="22"/>
+        </w:rPr>
+        <w:t xml:space="preserve">В </w:t>
+      </w:r>
+      <w:r>
+        <w:rPr>
+          <w:rFonts w:ascii="Courier New" w:hAnsi="Courier New"/>
+          <w:color w:val="141414"/>
+          <w:sz w:val="20"/>
+        </w:rPr>
+        <w:t>.env</w:t>
+      </w:r>
+      <w:r>
+        <w:rPr>
+          <w:rFonts w:ascii="Arial" w:hAnsi="Arial"/>
+          <w:sz w:val="22"/>
+        </w:rPr>
+        <w:t xml:space="preserve"> добавьте точный tag модели:</w:t>
       </w:r>
     </w:p>
     <w:p>
@@ -20500,431 +20866,100 @@
           <w:rFonts w:ascii="Courier New" w:hAnsi="Courier New"/>
           <w:sz w:val="17"/>
         </w:rPr>
-        <w:t>cat &gt; librechat/render-config.sh &lt;&lt;'EOF'</w:t>
-      </w:r>
-      <w:r>
-        <w:br/>
-      </w:r>
-      <w:r>
-        <w:rPr>
-          <w:rFonts w:ascii="Courier New" w:hAnsi="Courier New"/>
-          <w:sz w:val="17"/>
-        </w:rPr>
-        <w:t>#!/bin/sh</w:t>
-      </w:r>
-      <w:r>
-        <w:br/>
-      </w:r>
-      <w:r>
-        <w:rPr>
-          <w:rFonts w:ascii="Courier New" w:hAnsi="Courier New"/>
-          <w:sz w:val="17"/>
-        </w:rPr>
-        <w:t>set -eu</w:t>
-      </w:r>
-      <w:r>
-        <w:br/>
-      </w:r>
-      <w:r>
-        <w:rPr>
-          <w:rFonts w:ascii="Courier New" w:hAnsi="Courier New"/>
-          <w:sz w:val="17"/>
-        </w:rPr>
-      </w:r>
-      <w:r>
-        <w:br/>
-      </w:r>
-      <w:r>
-        <w:rPr>
-          <w:rFonts w:ascii="Courier New" w:hAnsi="Courier New"/>
-          <w:sz w:val="17"/>
-        </w:rPr>
-        <w:t>models="${LIBRECHAT_MODELS:-${OPENAI_MODEL:-qwen2.5:7b}}"</w:t>
-      </w:r>
-      <w:r>
-        <w:br/>
-      </w:r>
-      <w:r>
-        <w:rPr>
-          <w:rFonts w:ascii="Courier New" w:hAnsi="Courier New"/>
-          <w:sz w:val="17"/>
-        </w:rPr>
-        <w:t>title_model="${LIBRECHAT_TITLE_MODEL:-${OPENAI_MODEL:-qwen2.5:7b}}"</w:t>
-      </w:r>
-      <w:r>
-        <w:br/>
-      </w:r>
-      <w:r>
-        <w:rPr>
-          <w:rFonts w:ascii="Courier New" w:hAnsi="Courier New"/>
-          <w:sz w:val="17"/>
-        </w:rPr>
-        <w:t>summary_model="${LIBRECHAT_SUMMARY_MODEL:-$title_model}"</w:t>
-      </w:r>
-      <w:r>
-        <w:br/>
-      </w:r>
-      <w:r>
-        <w:rPr>
-          <w:rFonts w:ascii="Courier New" w:hAnsi="Courier New"/>
-          <w:sz w:val="17"/>
-        </w:rPr>
-        <w:t>model_yaml=""</w:t>
-      </w:r>
-      <w:r>
-        <w:br/>
-      </w:r>
-      <w:r>
-        <w:rPr>
-          <w:rFonts w:ascii="Courier New" w:hAnsi="Courier New"/>
-          <w:sz w:val="17"/>
-        </w:rPr>
-      </w:r>
-      <w:r>
-        <w:br/>
-      </w:r>
-      <w:r>
-        <w:rPr>
-          <w:rFonts w:ascii="Courier New" w:hAnsi="Courier New"/>
-          <w:sz w:val="17"/>
-        </w:rPr>
-        <w:t>old_ifs="$IFS"</w:t>
-      </w:r>
-      <w:r>
-        <w:br/>
-      </w:r>
-      <w:r>
-        <w:rPr>
-          <w:rFonts w:ascii="Courier New" w:hAnsi="Courier New"/>
-          <w:sz w:val="17"/>
-        </w:rPr>
-        <w:t>IFS=','</w:t>
-      </w:r>
-      <w:r>
-        <w:br/>
-      </w:r>
-      <w:r>
-        <w:rPr>
-          <w:rFonts w:ascii="Courier New" w:hAnsi="Courier New"/>
-          <w:sz w:val="17"/>
-        </w:rPr>
-        <w:t>for model in $models; do</w:t>
-      </w:r>
-      <w:r>
-        <w:br/>
-      </w:r>
-      <w:r>
-        <w:rPr>
-          <w:rFonts w:ascii="Courier New" w:hAnsi="Courier New"/>
-          <w:sz w:val="17"/>
-        </w:rPr>
-        <w:t xml:space="preserve">  trimmed="$(printf '%s' "$model" | sed 's/^[[:space:]]*//;s/[[:space:]]*$//')"</w:t>
-      </w:r>
-      <w:r>
-        <w:br/>
-      </w:r>
-      <w:r>
-        <w:rPr>
-          <w:rFonts w:ascii="Courier New" w:hAnsi="Courier New"/>
-          <w:sz w:val="17"/>
-        </w:rPr>
-        <w:t xml:space="preserve">  if [ -n "$trimmed" ]; then</w:t>
-      </w:r>
-      <w:r>
-        <w:br/>
-      </w:r>
-      <w:r>
-        <w:rPr>
-          <w:rFonts w:ascii="Courier New" w:hAnsi="Courier New"/>
-          <w:sz w:val="17"/>
-        </w:rPr>
-        <w:t xml:space="preserve">    model_yaml="${model_yaml}          - \"${trimmed}\"</w:t>
-      </w:r>
-      <w:r>
-        <w:br/>
-      </w:r>
-      <w:r>
-        <w:rPr>
-          <w:rFonts w:ascii="Courier New" w:hAnsi="Courier New"/>
-          <w:sz w:val="17"/>
-        </w:rPr>
-        <w:t>"</w:t>
-      </w:r>
-      <w:r>
-        <w:br/>
-      </w:r>
-      <w:r>
-        <w:rPr>
-          <w:rFonts w:ascii="Courier New" w:hAnsi="Courier New"/>
-          <w:sz w:val="17"/>
-        </w:rPr>
-        <w:t xml:space="preserve">  fi</w:t>
-      </w:r>
-      <w:r>
-        <w:br/>
-      </w:r>
-      <w:r>
-        <w:rPr>
-          <w:rFonts w:ascii="Courier New" w:hAnsi="Courier New"/>
-          <w:sz w:val="17"/>
-        </w:rPr>
-        <w:t>done</w:t>
-      </w:r>
-      <w:r>
-        <w:br/>
-      </w:r>
-      <w:r>
-        <w:rPr>
-          <w:rFonts w:ascii="Courier New" w:hAnsi="Courier New"/>
-          <w:sz w:val="17"/>
-        </w:rPr>
-        <w:t>IFS="$old_ifs"</w:t>
-      </w:r>
-      <w:r>
-        <w:br/>
-      </w:r>
-      <w:r>
-        <w:rPr>
-          <w:rFonts w:ascii="Courier New" w:hAnsi="Courier New"/>
-          <w:sz w:val="17"/>
-        </w:rPr>
-      </w:r>
-      <w:r>
-        <w:br/>
-      </w:r>
-      <w:r>
-        <w:rPr>
-          <w:rFonts w:ascii="Courier New" w:hAnsi="Courier New"/>
-          <w:sz w:val="17"/>
-        </w:rPr>
-        <w:t>export AGENT_PROXY_API_KEY="${AGENT_PROXY_API_KEY:-local-dev-key}"</w:t>
-      </w:r>
-      <w:r>
-        <w:br/>
-      </w:r>
-      <w:r>
-        <w:rPr>
-          <w:rFonts w:ascii="Courier New" w:hAnsi="Courier New"/>
-          <w:sz w:val="17"/>
-        </w:rPr>
-        <w:t>export AGENT_PROXY_BASE_URL="${AGENT_PROXY_BASE_URL:-http://agent-proxy:3344/v1}"</w:t>
-      </w:r>
-      <w:r>
-        <w:br/>
-      </w:r>
-      <w:r>
-        <w:rPr>
-          <w:rFonts w:ascii="Courier New" w:hAnsi="Courier New"/>
-          <w:sz w:val="17"/>
-        </w:rPr>
-        <w:t>export LIBRECHAT_TITLE_MODEL="$title_model"</w:t>
-      </w:r>
-      <w:r>
-        <w:br/>
-      </w:r>
-      <w:r>
-        <w:rPr>
-          <w:rFonts w:ascii="Courier New" w:hAnsi="Courier New"/>
-          <w:sz w:val="17"/>
-        </w:rPr>
-        <w:t>export LIBRECHAT_SUMMARY_MODEL="$summary_model"</w:t>
-      </w:r>
-      <w:r>
-        <w:br/>
-      </w:r>
-      <w:r>
-        <w:rPr>
-          <w:rFonts w:ascii="Courier New" w:hAnsi="Courier New"/>
-          <w:sz w:val="17"/>
-        </w:rPr>
-        <w:t>export LIBRECHAT_MODEL_LIST_YAML="$model_yaml"</w:t>
-      </w:r>
-      <w:r>
-        <w:br/>
-      </w:r>
-      <w:r>
-        <w:rPr>
-          <w:rFonts w:ascii="Courier New" w:hAnsi="Courier New"/>
-          <w:sz w:val="17"/>
-        </w:rPr>
-      </w:r>
-      <w:r>
-        <w:br/>
-      </w:r>
-      <w:r>
-        <w:rPr>
-          <w:rFonts w:ascii="Courier New" w:hAnsi="Courier New"/>
-          <w:sz w:val="17"/>
-        </w:rPr>
-        <w:t>python3 - &lt;&lt;'PY'</w:t>
-      </w:r>
-      <w:r>
-        <w:br/>
-      </w:r>
-      <w:r>
-        <w:rPr>
-          <w:rFonts w:ascii="Courier New" w:hAnsi="Courier New"/>
-          <w:sz w:val="17"/>
-        </w:rPr>
-        <w:t>from pathlib import Path</w:t>
-      </w:r>
-      <w:r>
-        <w:br/>
-      </w:r>
-      <w:r>
-        <w:rPr>
-          <w:rFonts w:ascii="Courier New" w:hAnsi="Courier New"/>
-          <w:sz w:val="17"/>
-        </w:rPr>
-        <w:t>import os</w:t>
-      </w:r>
-      <w:r>
-        <w:br/>
-      </w:r>
-      <w:r>
-        <w:rPr>
-          <w:rFonts w:ascii="Courier New" w:hAnsi="Courier New"/>
-          <w:sz w:val="17"/>
-        </w:rPr>
-      </w:r>
-      <w:r>
-        <w:br/>
-      </w:r>
-      <w:r>
-        <w:rPr>
-          <w:rFonts w:ascii="Courier New" w:hAnsi="Courier New"/>
-          <w:sz w:val="17"/>
-        </w:rPr>
-        <w:t>template = Path('/app/librechat.yaml.template').read_text()</w:t>
-      </w:r>
-      <w:r>
-        <w:br/>
-      </w:r>
-      <w:r>
-        <w:rPr>
-          <w:rFonts w:ascii="Courier New" w:hAnsi="Courier New"/>
-          <w:sz w:val="17"/>
-        </w:rPr>
-        <w:t>for key in [</w:t>
-      </w:r>
-      <w:r>
-        <w:br/>
-      </w:r>
-      <w:r>
-        <w:rPr>
-          <w:rFonts w:ascii="Courier New" w:hAnsi="Courier New"/>
-          <w:sz w:val="17"/>
-        </w:rPr>
-        <w:t xml:space="preserve">    'AGENT_PROXY_API_KEY',</w:t>
-      </w:r>
-      <w:r>
-        <w:br/>
-      </w:r>
-      <w:r>
-        <w:rPr>
-          <w:rFonts w:ascii="Courier New" w:hAnsi="Courier New"/>
-          <w:sz w:val="17"/>
-        </w:rPr>
-        <w:t xml:space="preserve">    'AGENT_PROXY_BASE_URL',</w:t>
-      </w:r>
-      <w:r>
-        <w:br/>
-      </w:r>
-      <w:r>
-        <w:rPr>
-          <w:rFonts w:ascii="Courier New" w:hAnsi="Courier New"/>
-          <w:sz w:val="17"/>
-        </w:rPr>
-        <w:t xml:space="preserve">    'LIBRECHAT_TITLE_MODEL',</w:t>
-      </w:r>
-      <w:r>
-        <w:br/>
-      </w:r>
-      <w:r>
-        <w:rPr>
-          <w:rFonts w:ascii="Courier New" w:hAnsi="Courier New"/>
-          <w:sz w:val="17"/>
-        </w:rPr>
-        <w:t xml:space="preserve">    'LIBRECHAT_SUMMARY_MODEL',</w:t>
-      </w:r>
-      <w:r>
-        <w:br/>
-      </w:r>
-      <w:r>
-        <w:rPr>
-          <w:rFonts w:ascii="Courier New" w:hAnsi="Courier New"/>
-          <w:sz w:val="17"/>
-        </w:rPr>
-        <w:t xml:space="preserve">    'LIBRECHAT_MODEL_LIST_YAML',</w:t>
-      </w:r>
-      <w:r>
-        <w:br/>
-      </w:r>
-      <w:r>
-        <w:rPr>
-          <w:rFonts w:ascii="Courier New" w:hAnsi="Courier New"/>
-          <w:sz w:val="17"/>
-        </w:rPr>
-        <w:t>]:</w:t>
-      </w:r>
-      <w:r>
-        <w:br/>
-      </w:r>
-      <w:r>
-        <w:rPr>
-          <w:rFonts w:ascii="Courier New" w:hAnsi="Courier New"/>
-          <w:sz w:val="17"/>
-        </w:rPr>
-        <w:t xml:space="preserve">    template = template.replace('${' + key + '}', os.environ.get(key, ''))</w:t>
-      </w:r>
-      <w:r>
-        <w:br/>
-      </w:r>
-      <w:r>
-        <w:rPr>
-          <w:rFonts w:ascii="Courier New" w:hAnsi="Courier New"/>
-          <w:sz w:val="17"/>
-        </w:rPr>
-        <w:t>Path('/app/librechat.yaml').write_text(template)</w:t>
-      </w:r>
-      <w:r>
-        <w:br/>
-      </w:r>
-      <w:r>
-        <w:rPr>
-          <w:rFonts w:ascii="Courier New" w:hAnsi="Courier New"/>
-          <w:sz w:val="17"/>
-        </w:rPr>
-        <w:t>PY</w:t>
-      </w:r>
-      <w:r>
-        <w:br/>
-      </w:r>
-      <w:r>
-        <w:rPr>
-          <w:rFonts w:ascii="Courier New" w:hAnsi="Courier New"/>
-          <w:sz w:val="17"/>
-        </w:rPr>
-      </w:r>
-      <w:r>
-        <w:br/>
-      </w:r>
-      <w:r>
-        <w:rPr>
-          <w:rFonts w:ascii="Courier New" w:hAnsi="Courier New"/>
-          <w:sz w:val="17"/>
-        </w:rPr>
-        <w:t>exec npm run backend</w:t>
-      </w:r>
-      <w:r>
-        <w:br/>
-      </w:r>
-      <w:r>
-        <w:rPr>
-          <w:rFonts w:ascii="Courier New" w:hAnsi="Courier New"/>
-          <w:sz w:val="17"/>
-        </w:rPr>
-        <w:t>EOF</w:t>
+        <w:t>LIBRECHAT_MODELS=qwen2.5:7b,qwen2.5:14b,qwen3:14b,llama3.2-vision:latest</w:t>
+      </w:r>
+      <w:r>
+        <w:br/>
+      </w:r>
+      <w:r>
+        <w:rPr>
+          <w:rFonts w:ascii="Courier New" w:hAnsi="Courier New"/>
+          <w:sz w:val="17"/>
+        </w:rPr>
+        <w:t>OPENAI_MODEL_SMART=qwen3:14b</w:t>
+      </w:r>
+    </w:p>
+    <w:p>
+      <w:r>
+        <w:rPr>
+          <w:rFonts w:ascii="Arial" w:hAnsi="Arial"/>
+          <w:sz w:val="22"/>
+        </w:rPr>
+        <w:t xml:space="preserve">После изменения </w:t>
+      </w:r>
+      <w:r>
+        <w:rPr>
+          <w:rFonts w:ascii="Courier New" w:hAnsi="Courier New"/>
+          <w:color w:val="141414"/>
+          <w:sz w:val="20"/>
+        </w:rPr>
+        <w:t>.env</w:t>
+      </w:r>
+      <w:r>
+        <w:rPr>
+          <w:rFonts w:ascii="Arial" w:hAnsi="Arial"/>
+          <w:sz w:val="22"/>
+        </w:rPr>
+        <w:t xml:space="preserve"> пересоздайте LibreChat:</w:t>
+      </w:r>
+    </w:p>
+    <w:p>
+      <w:pPr>
+        <w:spacing w:before="60" w:after="120"/>
+      </w:pPr>
+      <w:r>
+        <w:rPr>
+          <w:rFonts w:ascii="Courier New" w:hAnsi="Courier New"/>
+          <w:sz w:val="17"/>
+        </w:rPr>
+        <w:t>docker compose up -d --force-recreate librechat</w:t>
+      </w:r>
+    </w:p>
+    <w:p>
+      <w:r>
+        <w:rPr>
+          <w:rFonts w:ascii="Courier New" w:hAnsi="Courier New"/>
+          <w:color w:val="141414"/>
+          <w:sz w:val="20"/>
+        </w:rPr>
+        <w:t>render-config.sh</w:t>
+      </w:r>
+      <w:r>
+        <w:rPr>
+          <w:rFonts w:ascii="Arial" w:hAnsi="Arial"/>
+          <w:sz w:val="22"/>
+        </w:rPr>
+        <w:t xml:space="preserve"> перечитает </w:t>
+      </w:r>
+      <w:r>
+        <w:rPr>
+          <w:rFonts w:ascii="Courier New" w:hAnsi="Courier New"/>
+          <w:color w:val="141414"/>
+          <w:sz w:val="20"/>
+        </w:rPr>
+        <w:t>.env</w:t>
+      </w:r>
+      <w:r>
+        <w:rPr>
+          <w:rFonts w:ascii="Arial" w:hAnsi="Arial"/>
+          <w:sz w:val="22"/>
+        </w:rPr>
+        <w:t xml:space="preserve"> при старте контейнера и соберет </w:t>
+      </w:r>
+      <w:r>
+        <w:rPr>
+          <w:rFonts w:ascii="Courier New" w:hAnsi="Courier New"/>
+          <w:color w:val="141414"/>
+          <w:sz w:val="20"/>
+        </w:rPr>
+        <w:t>/app/librechat.yaml</w:t>
+      </w:r>
+      <w:r>
+        <w:rPr>
+          <w:rFonts w:ascii="Arial" w:hAnsi="Arial"/>
+          <w:sz w:val="22"/>
+        </w:rPr>
+        <w:t xml:space="preserve"> с новым списком моделей.</w:t>
       </w:r>
     </w:p>
     <w:p>

</xml_diff>

<commit_message>
Improve Prometheus Grafana dashboards
</commit_message>
<xml_diff>
--- a/docs/JUNIOR_DEVOPS_DEPLOYMENT_GUIDE.docx
+++ b/docs/JUNIOR_DEVOPS_DEPLOYMENT_GUIDE.docx
@@ -389,16 +389,7 @@
           <w:rFonts w:ascii="Arial" w:hAnsi="Arial"/>
           <w:sz w:val="22"/>
         </w:rPr>
-        <w:t>Он не хранит данные как аналитическая БД.</w:t>
-      </w:r>
-    </w:p>
-    <w:p>
-      <w:r>
-        <w:rPr>
-          <w:rFonts w:ascii="Arial" w:hAnsi="Arial"/>
-          <w:sz w:val="22"/>
-        </w:rPr>
-        <w:t>Он подключается к source-БД и читает журнал изменений.</w:t>
+        <w:t>Он не хранит данные как аналитическая БД, но подключается к source-БД и читает журнал изменений.</w:t>
       </w:r>
     </w:p>
     <w:p>
@@ -411,6 +402,9 @@
       </w:r>
     </w:p>
     <w:p>
+      <w:pPr>
+        <w:pStyle w:val="ListBullet"/>
+      </w:pPr>
       <w:r>
         <w:rPr>
           <w:rFonts w:ascii="Arial" w:hAnsi="Arial"/>
@@ -425,10 +419,13 @@
           <w:rFonts w:ascii="Arial" w:hAnsi="Arial"/>
           <w:sz w:val="22"/>
         </w:rPr>
-        <w:t>Для MySQL это binlog.</w:t>
-      </w:r>
-    </w:p>
-    <w:p>
+        <w:t>Для MySQL - binlog.</w:t>
+      </w:r>
+    </w:p>
+    <w:p>
+      <w:pPr>
+        <w:pStyle w:val="ListBullet"/>
+      </w:pPr>
       <w:r>
         <w:rPr>
           <w:rFonts w:ascii="Arial" w:hAnsi="Arial"/>
@@ -443,10 +440,13 @@
           <w:rFonts w:ascii="Arial" w:hAnsi="Arial"/>
           <w:sz w:val="22"/>
         </w:rPr>
-        <w:t>Для MongoDB это change stream.</w:t>
-      </w:r>
-    </w:p>
-    <w:p>
+        <w:t>Для MongoDB - change stream.</w:t>
+      </w:r>
+    </w:p>
+    <w:p>
+      <w:pPr>
+        <w:pStyle w:val="ListBullet"/>
+      </w:pPr>
       <w:r>
         <w:rPr>
           <w:rFonts w:ascii="Arial" w:hAnsi="Arial"/>
@@ -636,6 +636,9 @@
       </w:r>
     </w:p>
     <w:p>
+      <w:pPr>
+        <w:pStyle w:val="ListBullet"/>
+      </w:pPr>
       <w:r>
         <w:rPr>
           <w:rFonts w:ascii="Arial" w:hAnsi="Arial"/>
@@ -666,6 +669,9 @@
       </w:r>
     </w:p>
     <w:p>
+      <w:pPr>
+        <w:pStyle w:val="ListBullet"/>
+      </w:pPr>
       <w:r>
         <w:rPr>
           <w:rFonts w:ascii="Arial" w:hAnsi="Arial"/>
@@ -768,90 +774,6 @@
           <w:sz w:val="22"/>
         </w:rPr>
         <w:t>.</w:t>
-      </w:r>
-    </w:p>
-    <w:p>
-      <w:r>
-        <w:rPr>
-          <w:rFonts w:ascii="Arial" w:hAnsi="Arial"/>
-          <w:sz w:val="22"/>
-        </w:rPr>
-        <w:t xml:space="preserve">Это сделано намеренно: у разных метрик разные labels, и жесткая таблица с колонками </w:t>
-      </w:r>
-      <w:r>
-        <w:rPr>
-          <w:rFonts w:ascii="Courier New" w:hAnsi="Courier New"/>
-          <w:color w:val="141414"/>
-          <w:sz w:val="20"/>
-        </w:rPr>
-        <w:t>job</w:t>
-      </w:r>
-      <w:r>
-        <w:rPr>
-          <w:rFonts w:ascii="Arial" w:hAnsi="Arial"/>
-          <w:sz w:val="22"/>
-        </w:rPr>
-        <w:t xml:space="preserve">, </w:t>
-      </w:r>
-      <w:r>
-        <w:rPr>
-          <w:rFonts w:ascii="Courier New" w:hAnsi="Courier New"/>
-          <w:color w:val="141414"/>
-          <w:sz w:val="20"/>
-        </w:rPr>
-        <w:t>instance</w:t>
-      </w:r>
-      <w:r>
-        <w:rPr>
-          <w:rFonts w:ascii="Arial" w:hAnsi="Arial"/>
-          <w:sz w:val="22"/>
-        </w:rPr>
-        <w:t xml:space="preserve">, </w:t>
-      </w:r>
-      <w:r>
-        <w:rPr>
-          <w:rFonts w:ascii="Courier New" w:hAnsi="Courier New"/>
-          <w:color w:val="141414"/>
-          <w:sz w:val="20"/>
-        </w:rPr>
-        <w:t>pod</w:t>
-      </w:r>
-      <w:r>
-        <w:rPr>
-          <w:rFonts w:ascii="Arial" w:hAnsi="Arial"/>
-          <w:sz w:val="22"/>
-        </w:rPr>
-        <w:t xml:space="preserve">, </w:t>
-      </w:r>
-      <w:r>
-        <w:rPr>
-          <w:rFonts w:ascii="Courier New" w:hAnsi="Courier New"/>
-          <w:color w:val="141414"/>
-          <w:sz w:val="20"/>
-        </w:rPr>
-        <w:t>namespace</w:t>
-      </w:r>
-      <w:r>
-        <w:rPr>
-          <w:rFonts w:ascii="Arial" w:hAnsi="Arial"/>
-          <w:sz w:val="22"/>
-        </w:rPr>
-        <w:t xml:space="preserve">, </w:t>
-      </w:r>
-      <w:r>
-        <w:rPr>
-          <w:rFonts w:ascii="Courier New" w:hAnsi="Courier New"/>
-          <w:color w:val="141414"/>
-          <w:sz w:val="20"/>
-        </w:rPr>
-        <w:t>route</w:t>
-      </w:r>
-      <w:r>
-        <w:rPr>
-          <w:rFonts w:ascii="Arial" w:hAnsi="Arial"/>
-          <w:sz w:val="22"/>
-        </w:rPr>
-        <w:t xml:space="preserve"> быстро стала бы неудобной.</w:t>
       </w:r>
     </w:p>
     <w:p>
@@ -21135,7 +21057,7 @@
           <w:rFonts w:ascii="Courier New" w:hAnsi="Courier New"/>
           <w:sz w:val="17"/>
         </w:rPr>
-        <w:t xml:space="preserve">    description: 'Count rows in any analytics table grouped by one to three columns.',</w:t>
+        <w:t xml:space="preserve">    description: 'Count rows in any analytics table grouped by one to three columns, with optional equality and comparison filters.',</w:t>
       </w:r>
       <w:r>
         <w:br/>
@@ -21285,6 +21207,166 @@
           <w:rFonts w:ascii="Courier New" w:hAnsi="Courier New"/>
           <w:sz w:val="17"/>
         </w:rPr>
+        <w:t xml:space="preserve">        filter_conditions: {</w:t>
+      </w:r>
+      <w:r>
+        <w:br/>
+      </w:r>
+      <w:r>
+        <w:rPr>
+          <w:rFonts w:ascii="Courier New" w:hAnsi="Courier New"/>
+          <w:sz w:val="17"/>
+        </w:rPr>
+        <w:t xml:space="preserve">          type: 'array',</w:t>
+      </w:r>
+      <w:r>
+        <w:br/>
+      </w:r>
+      <w:r>
+        <w:rPr>
+          <w:rFonts w:ascii="Courier New" w:hAnsi="Courier New"/>
+          <w:sz w:val="17"/>
+        </w:rPr>
+        <w:t xml:space="preserve">          description: 'Optional comparison filters. Operators: =, !=, &gt;, &gt;=, &lt;, &lt;=.',</w:t>
+      </w:r>
+      <w:r>
+        <w:br/>
+      </w:r>
+      <w:r>
+        <w:rPr>
+          <w:rFonts w:ascii="Courier New" w:hAnsi="Courier New"/>
+          <w:sz w:val="17"/>
+        </w:rPr>
+        <w:t xml:space="preserve">          items: {</w:t>
+      </w:r>
+      <w:r>
+        <w:br/>
+      </w:r>
+      <w:r>
+        <w:rPr>
+          <w:rFonts w:ascii="Courier New" w:hAnsi="Courier New"/>
+          <w:sz w:val="17"/>
+        </w:rPr>
+        <w:t xml:space="preserve">            type: 'object',</w:t>
+      </w:r>
+      <w:r>
+        <w:br/>
+      </w:r>
+      <w:r>
+        <w:rPr>
+          <w:rFonts w:ascii="Courier New" w:hAnsi="Courier New"/>
+          <w:sz w:val="17"/>
+        </w:rPr>
+        <w:t xml:space="preserve">            properties: {</w:t>
+      </w:r>
+      <w:r>
+        <w:br/>
+      </w:r>
+      <w:r>
+        <w:rPr>
+          <w:rFonts w:ascii="Courier New" w:hAnsi="Courier New"/>
+          <w:sz w:val="17"/>
+        </w:rPr>
+        <w:t xml:space="preserve">              column: { type: 'string', description: 'Column name.' },</w:t>
+      </w:r>
+      <w:r>
+        <w:br/>
+      </w:r>
+      <w:r>
+        <w:rPr>
+          <w:rFonts w:ascii="Courier New" w:hAnsi="Courier New"/>
+          <w:sz w:val="17"/>
+        </w:rPr>
+        <w:t xml:space="preserve">              operator: {</w:t>
+      </w:r>
+      <w:r>
+        <w:br/>
+      </w:r>
+      <w:r>
+        <w:rPr>
+          <w:rFonts w:ascii="Courier New" w:hAnsi="Courier New"/>
+          <w:sz w:val="17"/>
+        </w:rPr>
+        <w:t xml:space="preserve">                type: 'string',</w:t>
+      </w:r>
+      <w:r>
+        <w:br/>
+      </w:r>
+      <w:r>
+        <w:rPr>
+          <w:rFonts w:ascii="Courier New" w:hAnsi="Courier New"/>
+          <w:sz w:val="17"/>
+        </w:rPr>
+        <w:t xml:space="preserve">                enum: ['=', '!=', '&gt;', '&gt;=', '&lt;', '&lt;=', 'eq', 'ne', 'gt', 'gte', 'lt', 'lte'],</w:t>
+      </w:r>
+      <w:r>
+        <w:br/>
+      </w:r>
+      <w:r>
+        <w:rPr>
+          <w:rFonts w:ascii="Courier New" w:hAnsi="Courier New"/>
+          <w:sz w:val="17"/>
+        </w:rPr>
+        <w:t xml:space="preserve">              },</w:t>
+      </w:r>
+      <w:r>
+        <w:br/>
+      </w:r>
+      <w:r>
+        <w:rPr>
+          <w:rFonts w:ascii="Courier New" w:hAnsi="Courier New"/>
+          <w:sz w:val="17"/>
+        </w:rPr>
+        <w:t xml:space="preserve">              value: { type: ['string', 'number', 'boolean'], description: 'Comparison value.' },</w:t>
+      </w:r>
+      <w:r>
+        <w:br/>
+      </w:r>
+      <w:r>
+        <w:rPr>
+          <w:rFonts w:ascii="Courier New" w:hAnsi="Courier New"/>
+          <w:sz w:val="17"/>
+        </w:rPr>
+        <w:t xml:space="preserve">            },</w:t>
+      </w:r>
+      <w:r>
+        <w:br/>
+      </w:r>
+      <w:r>
+        <w:rPr>
+          <w:rFonts w:ascii="Courier New" w:hAnsi="Courier New"/>
+          <w:sz w:val="17"/>
+        </w:rPr>
+        <w:t xml:space="preserve">            required: ['column', 'operator', 'value'],</w:t>
+      </w:r>
+      <w:r>
+        <w:br/>
+      </w:r>
+      <w:r>
+        <w:rPr>
+          <w:rFonts w:ascii="Courier New" w:hAnsi="Courier New"/>
+          <w:sz w:val="17"/>
+        </w:rPr>
+        <w:t xml:space="preserve">          },</w:t>
+      </w:r>
+      <w:r>
+        <w:br/>
+      </w:r>
+      <w:r>
+        <w:rPr>
+          <w:rFonts w:ascii="Courier New" w:hAnsi="Courier New"/>
+          <w:sz w:val="17"/>
+        </w:rPr>
+        <w:t xml:space="preserve">        },</w:t>
+      </w:r>
+      <w:r>
+        <w:br/>
+      </w:r>
+      <w:r>
+        <w:rPr>
+          <w:rFonts w:ascii="Courier New" w:hAnsi="Courier New"/>
+          <w:sz w:val="17"/>
+        </w:rPr>
         <w:t xml:space="preserve">        limit: { type: 'number', description: 'Maximum number of grouped rows.', default: 100 },</w:t>
       </w:r>
       <w:r>
@@ -21471,6 +21553,294 @@
           <w:rFonts w:ascii="Courier New" w:hAnsi="Courier New"/>
           <w:sz w:val="17"/>
         </w:rPr>
+        <w:t>function sqlLiteral(value) {</w:t>
+      </w:r>
+      <w:r>
+        <w:br/>
+      </w:r>
+      <w:r>
+        <w:rPr>
+          <w:rFonts w:ascii="Courier New" w:hAnsi="Courier New"/>
+          <w:sz w:val="17"/>
+        </w:rPr>
+        <w:t xml:space="preserve">  if (typeof value === 'number') {</w:t>
+      </w:r>
+      <w:r>
+        <w:br/>
+      </w:r>
+      <w:r>
+        <w:rPr>
+          <w:rFonts w:ascii="Courier New" w:hAnsi="Courier New"/>
+          <w:sz w:val="17"/>
+        </w:rPr>
+        <w:t xml:space="preserve">    if (!Number.isFinite(value)) throw new Error('Only finite numeric filter values are allowed.');</w:t>
+      </w:r>
+      <w:r>
+        <w:br/>
+      </w:r>
+      <w:r>
+        <w:rPr>
+          <w:rFonts w:ascii="Courier New" w:hAnsi="Courier New"/>
+          <w:sz w:val="17"/>
+        </w:rPr>
+        <w:t xml:space="preserve">    return String(value);</w:t>
+      </w:r>
+      <w:r>
+        <w:br/>
+      </w:r>
+      <w:r>
+        <w:rPr>
+          <w:rFonts w:ascii="Courier New" w:hAnsi="Courier New"/>
+          <w:sz w:val="17"/>
+        </w:rPr>
+        <w:t xml:space="preserve">  }</w:t>
+      </w:r>
+      <w:r>
+        <w:br/>
+      </w:r>
+      <w:r>
+        <w:rPr>
+          <w:rFonts w:ascii="Courier New" w:hAnsi="Courier New"/>
+          <w:sz w:val="17"/>
+        </w:rPr>
+        <w:t xml:space="preserve">  if (typeof value === 'boolean') return value ? '1' : '0';</w:t>
+      </w:r>
+      <w:r>
+        <w:br/>
+      </w:r>
+      <w:r>
+        <w:rPr>
+          <w:rFonts w:ascii="Courier New" w:hAnsi="Courier New"/>
+          <w:sz w:val="17"/>
+        </w:rPr>
+        <w:t xml:space="preserve">  return quoteString(value);</w:t>
+      </w:r>
+      <w:r>
+        <w:br/>
+      </w:r>
+      <w:r>
+        <w:rPr>
+          <w:rFonts w:ascii="Courier New" w:hAnsi="Courier New"/>
+          <w:sz w:val="17"/>
+        </w:rPr>
+        <w:t>}</w:t>
+      </w:r>
+      <w:r>
+        <w:br/>
+      </w:r>
+      <w:r>
+        <w:rPr>
+          <w:rFonts w:ascii="Courier New" w:hAnsi="Courier New"/>
+          <w:sz w:val="17"/>
+        </w:rPr>
+      </w:r>
+      <w:r>
+        <w:br/>
+      </w:r>
+      <w:r>
+        <w:rPr>
+          <w:rFonts w:ascii="Courier New" w:hAnsi="Courier New"/>
+          <w:sz w:val="17"/>
+        </w:rPr>
+        <w:t>function normalizeFilterOperator(operator) {</w:t>
+      </w:r>
+      <w:r>
+        <w:br/>
+      </w:r>
+      <w:r>
+        <w:rPr>
+          <w:rFonts w:ascii="Courier New" w:hAnsi="Courier New"/>
+          <w:sz w:val="17"/>
+        </w:rPr>
+        <w:t xml:space="preserve">  const operators = {</w:t>
+      </w:r>
+      <w:r>
+        <w:br/>
+      </w:r>
+      <w:r>
+        <w:rPr>
+          <w:rFonts w:ascii="Courier New" w:hAnsi="Courier New"/>
+          <w:sz w:val="17"/>
+        </w:rPr>
+        <w:t xml:space="preserve">    '=': '=',</w:t>
+      </w:r>
+      <w:r>
+        <w:br/>
+      </w:r>
+      <w:r>
+        <w:rPr>
+          <w:rFonts w:ascii="Courier New" w:hAnsi="Courier New"/>
+          <w:sz w:val="17"/>
+        </w:rPr>
+        <w:t xml:space="preserve">    eq: '=',</w:t>
+      </w:r>
+      <w:r>
+        <w:br/>
+      </w:r>
+      <w:r>
+        <w:rPr>
+          <w:rFonts w:ascii="Courier New" w:hAnsi="Courier New"/>
+          <w:sz w:val="17"/>
+        </w:rPr>
+        <w:t xml:space="preserve">    '!=': '!=',</w:t>
+      </w:r>
+      <w:r>
+        <w:br/>
+      </w:r>
+      <w:r>
+        <w:rPr>
+          <w:rFonts w:ascii="Courier New" w:hAnsi="Courier New"/>
+          <w:sz w:val="17"/>
+        </w:rPr>
+        <w:t xml:space="preserve">    ne: '!=',</w:t>
+      </w:r>
+      <w:r>
+        <w:br/>
+      </w:r>
+      <w:r>
+        <w:rPr>
+          <w:rFonts w:ascii="Courier New" w:hAnsi="Courier New"/>
+          <w:sz w:val="17"/>
+        </w:rPr>
+        <w:t xml:space="preserve">    '&gt;': '&gt;',</w:t>
+      </w:r>
+      <w:r>
+        <w:br/>
+      </w:r>
+      <w:r>
+        <w:rPr>
+          <w:rFonts w:ascii="Courier New" w:hAnsi="Courier New"/>
+          <w:sz w:val="17"/>
+        </w:rPr>
+        <w:t xml:space="preserve">    gt: '&gt;',</w:t>
+      </w:r>
+      <w:r>
+        <w:br/>
+      </w:r>
+      <w:r>
+        <w:rPr>
+          <w:rFonts w:ascii="Courier New" w:hAnsi="Courier New"/>
+          <w:sz w:val="17"/>
+        </w:rPr>
+        <w:t xml:space="preserve">    '&gt;=': '&gt;=',</w:t>
+      </w:r>
+      <w:r>
+        <w:br/>
+      </w:r>
+      <w:r>
+        <w:rPr>
+          <w:rFonts w:ascii="Courier New" w:hAnsi="Courier New"/>
+          <w:sz w:val="17"/>
+        </w:rPr>
+        <w:t xml:space="preserve">    gte: '&gt;=',</w:t>
+      </w:r>
+      <w:r>
+        <w:br/>
+      </w:r>
+      <w:r>
+        <w:rPr>
+          <w:rFonts w:ascii="Courier New" w:hAnsi="Courier New"/>
+          <w:sz w:val="17"/>
+        </w:rPr>
+        <w:t xml:space="preserve">    '&lt;': '&lt;',</w:t>
+      </w:r>
+      <w:r>
+        <w:br/>
+      </w:r>
+      <w:r>
+        <w:rPr>
+          <w:rFonts w:ascii="Courier New" w:hAnsi="Courier New"/>
+          <w:sz w:val="17"/>
+        </w:rPr>
+        <w:t xml:space="preserve">    lt: '&lt;',</w:t>
+      </w:r>
+      <w:r>
+        <w:br/>
+      </w:r>
+      <w:r>
+        <w:rPr>
+          <w:rFonts w:ascii="Courier New" w:hAnsi="Courier New"/>
+          <w:sz w:val="17"/>
+        </w:rPr>
+        <w:t xml:space="preserve">    '&lt;=': '&lt;=',</w:t>
+      </w:r>
+      <w:r>
+        <w:br/>
+      </w:r>
+      <w:r>
+        <w:rPr>
+          <w:rFonts w:ascii="Courier New" w:hAnsi="Courier New"/>
+          <w:sz w:val="17"/>
+        </w:rPr>
+        <w:t xml:space="preserve">    lte: '&lt;=',</w:t>
+      </w:r>
+      <w:r>
+        <w:br/>
+      </w:r>
+      <w:r>
+        <w:rPr>
+          <w:rFonts w:ascii="Courier New" w:hAnsi="Courier New"/>
+          <w:sz w:val="17"/>
+        </w:rPr>
+        <w:t xml:space="preserve">  };</w:t>
+      </w:r>
+      <w:r>
+        <w:br/>
+      </w:r>
+      <w:r>
+        <w:rPr>
+          <w:rFonts w:ascii="Courier New" w:hAnsi="Courier New"/>
+          <w:sz w:val="17"/>
+        </w:rPr>
+        <w:t xml:space="preserve">  const sqlOperator = operators[String(operator || '').trim().toLowerCase()];</w:t>
+      </w:r>
+      <w:r>
+        <w:br/>
+      </w:r>
+      <w:r>
+        <w:rPr>
+          <w:rFonts w:ascii="Courier New" w:hAnsi="Courier New"/>
+          <w:sz w:val="17"/>
+        </w:rPr>
+        <w:t xml:space="preserve">  if (!sqlOperator) throw new Error(`Unsupported filter operator: ${operator}`);</w:t>
+      </w:r>
+      <w:r>
+        <w:br/>
+      </w:r>
+      <w:r>
+        <w:rPr>
+          <w:rFonts w:ascii="Courier New" w:hAnsi="Courier New"/>
+          <w:sz w:val="17"/>
+        </w:rPr>
+        <w:t xml:space="preserve">  return sqlOperator;</w:t>
+      </w:r>
+      <w:r>
+        <w:br/>
+      </w:r>
+      <w:r>
+        <w:rPr>
+          <w:rFonts w:ascii="Courier New" w:hAnsi="Courier New"/>
+          <w:sz w:val="17"/>
+        </w:rPr>
+        <w:t>}</w:t>
+      </w:r>
+      <w:r>
+        <w:br/>
+      </w:r>
+      <w:r>
+        <w:rPr>
+          <w:rFonts w:ascii="Courier New" w:hAnsi="Courier New"/>
+          <w:sz w:val="17"/>
+        </w:rPr>
+      </w:r>
+      <w:r>
+        <w:br/>
+      </w:r>
+      <w:r>
+        <w:rPr>
+          <w:rFonts w:ascii="Courier New" w:hAnsi="Courier New"/>
+          <w:sz w:val="17"/>
+        </w:rPr>
         <w:t>function quoteIdent(value) {</w:t>
       </w:r>
       <w:r>
@@ -23583,7 +23953,7 @@
           <w:rFonts w:ascii="Courier New" w:hAnsi="Courier New"/>
           <w:sz w:val="17"/>
         </w:rPr>
-        <w:t xml:space="preserve">      whereParts.push(`${quoteIdent(columnName)} = ${typeof value === 'number' ? String(value) : quoteString(value)}`);</w:t>
+        <w:t xml:space="preserve">      whereParts.push(`${quoteIdent(columnName)} = ${sqlLiteral(value)}`);</w:t>
       </w:r>
       <w:r>
         <w:br/>
@@ -23603,6 +23973,66 @@
           <w:rFonts w:ascii="Courier New" w:hAnsi="Courier New"/>
           <w:sz w:val="17"/>
         </w:rPr>
+        <w:t xml:space="preserve">    const filterConditions = Array.isArray(args.filter_conditions) ? args.filter_conditions : [];</w:t>
+      </w:r>
+      <w:r>
+        <w:br/>
+      </w:r>
+      <w:r>
+        <w:rPr>
+          <w:rFonts w:ascii="Courier New" w:hAnsi="Courier New"/>
+          <w:sz w:val="17"/>
+        </w:rPr>
+        <w:t xml:space="preserve">    for (const condition of filterConditions) {</w:t>
+      </w:r>
+      <w:r>
+        <w:br/>
+      </w:r>
+      <w:r>
+        <w:rPr>
+          <w:rFonts w:ascii="Courier New" w:hAnsi="Courier New"/>
+          <w:sz w:val="17"/>
+        </w:rPr>
+        <w:t xml:space="preserve">      const { columnName } = await analyticsColumnExists(tableName, condition?.column);</w:t>
+      </w:r>
+      <w:r>
+        <w:br/>
+      </w:r>
+      <w:r>
+        <w:rPr>
+          <w:rFonts w:ascii="Courier New" w:hAnsi="Courier New"/>
+          <w:sz w:val="17"/>
+        </w:rPr>
+        <w:t xml:space="preserve">      const operator = normalizeFilterOperator(condition?.operator);</w:t>
+      </w:r>
+      <w:r>
+        <w:br/>
+      </w:r>
+      <w:r>
+        <w:rPr>
+          <w:rFonts w:ascii="Courier New" w:hAnsi="Courier New"/>
+          <w:sz w:val="17"/>
+        </w:rPr>
+        <w:t xml:space="preserve">      whereParts.push(`${quoteIdent(columnName)} ${operator} ${sqlLiteral(condition?.value)}`);</w:t>
+      </w:r>
+      <w:r>
+        <w:br/>
+      </w:r>
+      <w:r>
+        <w:rPr>
+          <w:rFonts w:ascii="Courier New" w:hAnsi="Courier New"/>
+          <w:sz w:val="17"/>
+        </w:rPr>
+        <w:t xml:space="preserve">    }</w:t>
+      </w:r>
+      <w:r>
+        <w:br/>
+      </w:r>
+      <w:r>
+        <w:rPr>
+          <w:rFonts w:ascii="Courier New" w:hAnsi="Courier New"/>
+          <w:sz w:val="17"/>
+        </w:rPr>
         <w:t xml:space="preserve">    const limit = boundedLimit(args.limit, 100, 500);</w:t>
       </w:r>
       <w:r>
@@ -24545,7 +24975,17 @@
           <w:rFonts w:ascii="Courier New" w:hAnsi="Courier New"/>
           <w:sz w:val="17"/>
         </w:rPr>
-        <w:t xml:space="preserve">      If the user asks for counts or distributions, use count_analytics_by.</w:t>
+        <w:t xml:space="preserve">      If the user asks for counts or distributions, use count_analytics_by. For conditions like greater than, less than, at least, more than, before, after, or over a threshold, use count_analytics_by.filter_conditions with operators &gt;, &gt;=, &lt;, &lt;=, !=, or =. Use filters only for equality.</w:t>
+      </w:r>
+      <w:r>
+        <w:br/>
+      </w:r>
+      <w:r>
+        <w:rPr>
+          <w:rFonts w:ascii="Courier New" w:hAnsi="Courier New"/>
+          <w:sz w:val="17"/>
+        </w:rPr>
+        <w:t xml:space="preserve">      For any ClickHouse data question, the first step must be a real MCP tool call, not a written plan. Do not answer "I will call a tool", do not print JSON with a tool name, and do not ask the user to run a tool. If a tool is available, call it.</w:t>
       </w:r>
       <w:r>
         <w:br/>
@@ -30371,6 +30811,46 @@
           <w:rFonts w:ascii="Arial" w:hAnsi="Arial"/>
           <w:sz w:val="22"/>
         </w:rPr>
+        <w:t>;</w:t>
+      </w:r>
+    </w:p>
+    <w:p>
+      <w:pPr>
+        <w:pStyle w:val="ListBullet"/>
+      </w:pPr>
+      <w:r>
+        <w:rPr>
+          <w:rFonts w:ascii="Courier New" w:hAnsi="Courier New"/>
+          <w:color w:val="141414"/>
+          <w:sz w:val="20"/>
+        </w:rPr>
+        <w:t>create_prometheus_availability_dashboard</w:t>
+      </w:r>
+      <w:r>
+        <w:rPr>
+          <w:rFonts w:ascii="Arial" w:hAnsi="Arial"/>
+          <w:sz w:val="22"/>
+        </w:rPr>
+        <w:t>;</w:t>
+      </w:r>
+    </w:p>
+    <w:p>
+      <w:pPr>
+        <w:pStyle w:val="ListBullet"/>
+      </w:pPr>
+      <w:r>
+        <w:rPr>
+          <w:rFonts w:ascii="Courier New" w:hAnsi="Courier New"/>
+          <w:color w:val="141414"/>
+          <w:sz w:val="20"/>
+        </w:rPr>
+        <w:t>create_prometheus_metric_dashboard</w:t>
+      </w:r>
+      <w:r>
+        <w:rPr>
+          <w:rFonts w:ascii="Arial" w:hAnsi="Arial"/>
+          <w:sz w:val="22"/>
+        </w:rPr>
         <w:t>.</w:t>
       </w:r>
     </w:p>
@@ -30380,6 +30860,209 @@
           <w:rFonts w:ascii="Arial" w:hAnsi="Arial"/>
           <w:sz w:val="22"/>
         </w:rPr>
+        <w:t xml:space="preserve">Если пользователь просит создать dashboard в Grafana по Prometheus up/down, instance health, availability, incidents, service health, DB health или HTTP health, модель должна вызвать </w:t>
+      </w:r>
+      <w:r>
+        <w:rPr>
+          <w:rFonts w:ascii="Courier New" w:hAnsi="Courier New"/>
+          <w:color w:val="141414"/>
+          <w:sz w:val="20"/>
+        </w:rPr>
+        <w:t>create_prometheus_availability_dashboard</w:t>
+      </w:r>
+      <w:r>
+        <w:rPr>
+          <w:rFonts w:ascii="Arial" w:hAnsi="Arial"/>
+          <w:sz w:val="22"/>
+        </w:rPr>
+        <w:t>.</w:t>
+      </w:r>
+    </w:p>
+    <w:p>
+      <w:r>
+        <w:rPr>
+          <w:rFonts w:ascii="Arial" w:hAnsi="Arial"/>
+          <w:sz w:val="22"/>
+        </w:rPr>
+        <w:t xml:space="preserve">Важно: Prometheus metric </w:t>
+      </w:r>
+      <w:r>
+        <w:rPr>
+          <w:rFonts w:ascii="Courier New" w:hAnsi="Courier New"/>
+          <w:color w:val="141414"/>
+          <w:sz w:val="20"/>
+        </w:rPr>
+        <w:t>up</w:t>
+      </w:r>
+      <w:r>
+        <w:rPr>
+          <w:rFonts w:ascii="Arial" w:hAnsi="Arial"/>
+          <w:sz w:val="22"/>
+        </w:rPr>
+        <w:t xml:space="preserve"> в этом проекте показывает, жив ли scrape target </w:t>
+      </w:r>
+      <w:r>
+        <w:rPr>
+          <w:rFonts w:ascii="Courier New" w:hAnsi="Courier New"/>
+          <w:color w:val="141414"/>
+          <w:sz w:val="20"/>
+        </w:rPr>
+        <w:t>synthetic-exporter</w:t>
+      </w:r>
+      <w:r>
+        <w:rPr>
+          <w:rFonts w:ascii="Arial" w:hAnsi="Arial"/>
+          <w:sz w:val="22"/>
+        </w:rPr>
+        <w:t xml:space="preserve">. Это не список всех сервисов и БД. Для operational dashboard tool использует </w:t>
+      </w:r>
+      <w:r>
+        <w:rPr>
+          <w:rFonts w:ascii="Courier New" w:hAnsi="Courier New"/>
+          <w:color w:val="141414"/>
+          <w:sz w:val="20"/>
+        </w:rPr>
+        <w:t>synthetic_service_up</w:t>
+      </w:r>
+      <w:r>
+        <w:rPr>
+          <w:rFonts w:ascii="Arial" w:hAnsi="Arial"/>
+          <w:sz w:val="22"/>
+        </w:rPr>
+        <w:t xml:space="preserve">, </w:t>
+      </w:r>
+      <w:r>
+        <w:rPr>
+          <w:rFonts w:ascii="Courier New" w:hAnsi="Courier New"/>
+          <w:color w:val="141414"/>
+          <w:sz w:val="20"/>
+        </w:rPr>
+        <w:t>synthetic_incident_active</w:t>
+      </w:r>
+      <w:r>
+        <w:rPr>
+          <w:rFonts w:ascii="Arial" w:hAnsi="Arial"/>
+          <w:sz w:val="22"/>
+        </w:rPr>
+        <w:t>, HTTP latency/traffic и DB disk/lag/query метрики.</w:t>
+      </w:r>
+    </w:p>
+    <w:p>
+      <w:r>
+        <w:rPr>
+          <w:rFonts w:ascii="Arial" w:hAnsi="Arial"/>
+          <w:sz w:val="22"/>
+        </w:rPr>
+        <w:t xml:space="preserve">Если пользователь просит dashboard по одной конкретной Prometheus-метрике, например </w:t>
+      </w:r>
+      <w:r>
+        <w:rPr>
+          <w:rFonts w:ascii="Courier New" w:hAnsi="Courier New"/>
+          <w:color w:val="141414"/>
+          <w:sz w:val="20"/>
+        </w:rPr>
+        <w:t>synthetic_log_events_total</w:t>
+      </w:r>
+      <w:r>
+        <w:rPr>
+          <w:rFonts w:ascii="Arial" w:hAnsi="Arial"/>
+          <w:sz w:val="22"/>
+        </w:rPr>
+        <w:t xml:space="preserve">, модель должна вызвать </w:t>
+      </w:r>
+      <w:r>
+        <w:rPr>
+          <w:rFonts w:ascii="Courier New" w:hAnsi="Courier New"/>
+          <w:color w:val="141414"/>
+          <w:sz w:val="20"/>
+        </w:rPr>
+        <w:t>create_prometheus_metric_dashboard</w:t>
+      </w:r>
+      <w:r>
+        <w:rPr>
+          <w:rFonts w:ascii="Arial" w:hAnsi="Arial"/>
+          <w:sz w:val="22"/>
+        </w:rPr>
+        <w:t>.</w:t>
+      </w:r>
+    </w:p>
+    <w:p>
+      <w:r>
+        <w:rPr>
+          <w:rFonts w:ascii="Arial" w:hAnsi="Arial"/>
+          <w:sz w:val="22"/>
+        </w:rPr>
+        <w:t xml:space="preserve">Tool создает dashboard через Grafana API и возвращает прямой </w:t>
+      </w:r>
+      <w:r>
+        <w:rPr>
+          <w:rFonts w:ascii="Courier New" w:hAnsi="Courier New"/>
+          <w:color w:val="141414"/>
+          <w:sz w:val="20"/>
+        </w:rPr>
+        <w:t>browserUrl</w:t>
+      </w:r>
+      <w:r>
+        <w:rPr>
+          <w:rFonts w:ascii="Arial" w:hAnsi="Arial"/>
+          <w:sz w:val="22"/>
+        </w:rPr>
+        <w:t xml:space="preserve"> вида </w:t>
+      </w:r>
+      <w:r>
+        <w:rPr>
+          <w:rFonts w:ascii="Courier New" w:hAnsi="Courier New"/>
+          <w:color w:val="141414"/>
+          <w:sz w:val="20"/>
+        </w:rPr>
+        <w:t>http://localhost:3001/d/&lt;uid&gt;/&lt;slug&gt;</w:t>
+      </w:r>
+      <w:r>
+        <w:rPr>
+          <w:rFonts w:ascii="Arial" w:hAnsi="Arial"/>
+          <w:sz w:val="22"/>
+        </w:rPr>
+        <w:t>.</w:t>
+      </w:r>
+    </w:p>
+    <w:p>
+      <w:r>
+        <w:rPr>
+          <w:rFonts w:ascii="Courier New" w:hAnsi="Courier New"/>
+          <w:color w:val="141414"/>
+          <w:sz w:val="20"/>
+        </w:rPr>
+        <w:t>/goto</w:t>
+      </w:r>
+      <w:r>
+        <w:rPr>
+          <w:rFonts w:ascii="Arial" w:hAnsi="Arial"/>
+          <w:sz w:val="22"/>
+        </w:rPr>
+        <w:t xml:space="preserve"> short URL можно считать вторичной ссылкой, потому что он зависит от настроек Grafana </w:t>
+      </w:r>
+      <w:r>
+        <w:rPr>
+          <w:rFonts w:ascii="Courier New" w:hAnsi="Courier New"/>
+          <w:color w:val="141414"/>
+          <w:sz w:val="20"/>
+        </w:rPr>
+        <w:t>root_url</w:t>
+      </w:r>
+      <w:r>
+        <w:rPr>
+          <w:rFonts w:ascii="Arial" w:hAnsi="Arial"/>
+          <w:sz w:val="22"/>
+        </w:rPr>
+        <w:t>.</w:t>
+      </w:r>
+    </w:p>
+    <w:p>
+      <w:r>
+        <w:rPr>
+          <w:rFonts w:ascii="Arial" w:hAnsi="Arial"/>
+          <w:sz w:val="22"/>
+        </w:rPr>
         <w:t>Примеры запросов:</w:t>
       </w:r>
     </w:p>
@@ -30396,15 +31079,6 @@
       </w:r>
     </w:p>
     <w:p>
-      <w:r>
-        <w:rPr>
-          <w:rFonts w:ascii="Arial" w:hAnsi="Arial"/>
-          <w:sz w:val="22"/>
-        </w:rPr>
-        <w:t>![LibreChat Prometheus analysis](images/img_16.png)</w:t>
-      </w:r>
-    </w:p>
-    <w:p>
       <w:pPr>
         <w:spacing w:before="60" w:after="120"/>
       </w:pPr>
@@ -30426,6 +31100,214 @@
           <w:sz w:val="17"/>
         </w:rPr>
         <w:t>Какие значения label job есть у метрики http_requests_total?</w:t>
+      </w:r>
+    </w:p>
+    <w:p>
+      <w:pPr>
+        <w:spacing w:before="60" w:after="120"/>
+      </w:pPr>
+      <w:r>
+        <w:rPr>
+          <w:rFonts w:ascii="Courier New" w:hAnsi="Courier New"/>
+          <w:sz w:val="17"/>
+        </w:rPr>
+        <w:t>Создай в Grafana dashboard по метрике up с разбивкой по job за последние 24 часа и дай ссылку.</w:t>
+      </w:r>
+    </w:p>
+    <w:p>
+      <w:pPr>
+        <w:spacing w:before="60" w:after="120"/>
+      </w:pPr>
+      <w:r>
+        <w:rPr>
+          <w:rFonts w:ascii="Courier New" w:hAnsi="Courier New"/>
+          <w:sz w:val="17"/>
+        </w:rPr>
+        <w:t>Проанализируй prometheus_samples: какие instance и когда down, какие up? Сделай Grafana dashboard.</w:t>
+      </w:r>
+    </w:p>
+    <w:p>
+      <w:pPr>
+        <w:spacing w:before="60" w:after="120"/>
+      </w:pPr>
+      <w:r>
+        <w:rPr>
+          <w:rFonts w:ascii="Courier New" w:hAnsi="Courier New"/>
+          <w:sz w:val="17"/>
+        </w:rPr>
+        <w:t>Создай красивый operational dashboard по Prometheus: availability, incidents, HTTP latency, HTTP errors, DB disk usage и replication lag.</w:t>
+      </w:r>
+    </w:p>
+    <w:p>
+      <w:pPr>
+        <w:pStyle w:val="Heading3"/>
+      </w:pPr>
+      <w:r>
+        <w:t>15.6 Grafana Dashboard По PostgreSQL Demo Inventory</w:t>
+      </w:r>
+    </w:p>
+    <w:p>
+      <w:r>
+        <w:rPr>
+          <w:rFonts w:ascii="Arial" w:hAnsi="Arial"/>
+          <w:sz w:val="22"/>
+        </w:rPr>
+        <w:t>PostgreSQL demo inventory попадает в ClickHouse table:</w:t>
+      </w:r>
+    </w:p>
+    <w:p>
+      <w:pPr>
+        <w:spacing w:before="60" w:after="120"/>
+      </w:pPr>
+      <w:r>
+        <w:rPr>
+          <w:rFonts w:ascii="Courier New" w:hAnsi="Courier New"/>
+          <w:sz w:val="17"/>
+        </w:rPr>
+        <w:t>analytics.car_inventory_raw</w:t>
+      </w:r>
+    </w:p>
+    <w:p>
+      <w:r>
+        <w:rPr>
+          <w:rFonts w:ascii="Arial" w:hAnsi="Arial"/>
+          <w:sz w:val="22"/>
+        </w:rPr>
+        <w:t>Для этой таблицы LibreChat может использовать MCP tool:</w:t>
+      </w:r>
+    </w:p>
+    <w:p>
+      <w:pPr>
+        <w:pStyle w:val="ListBullet"/>
+      </w:pPr>
+      <w:r>
+        <w:rPr>
+          <w:rFonts w:ascii="Courier New" w:hAnsi="Courier New"/>
+          <w:color w:val="141414"/>
+          <w:sz w:val="20"/>
+        </w:rPr>
+        <w:t>create_car_inventory_dashboard</w:t>
+      </w:r>
+      <w:r>
+        <w:rPr>
+          <w:rFonts w:ascii="Arial" w:hAnsi="Arial"/>
+          <w:sz w:val="22"/>
+        </w:rPr>
+        <w:t>.</w:t>
+      </w:r>
+    </w:p>
+    <w:p>
+      <w:r>
+        <w:rPr>
+          <w:rFonts w:ascii="Arial" w:hAnsi="Arial"/>
+          <w:sz w:val="22"/>
+        </w:rPr>
+        <w:t xml:space="preserve">Если пользователь просит создать dashboard по складам, автомобилям, городам, брендам, пробегу, ценам или статусам машин, модель должна вызвать </w:t>
+      </w:r>
+      <w:r>
+        <w:rPr>
+          <w:rFonts w:ascii="Courier New" w:hAnsi="Courier New"/>
+          <w:color w:val="141414"/>
+          <w:sz w:val="20"/>
+        </w:rPr>
+        <w:t>create_car_inventory_dashboard</w:t>
+      </w:r>
+      <w:r>
+        <w:rPr>
+          <w:rFonts w:ascii="Arial" w:hAnsi="Arial"/>
+          <w:sz w:val="22"/>
+        </w:rPr>
+        <w:t>.</w:t>
+      </w:r>
+    </w:p>
+    <w:p>
+      <w:r>
+        <w:rPr>
+          <w:rFonts w:ascii="Arial" w:hAnsi="Arial"/>
+          <w:sz w:val="22"/>
+        </w:rPr>
+        <w:t xml:space="preserve">Tool создает Grafana dashboard через API и возвращает прямой </w:t>
+      </w:r>
+      <w:r>
+        <w:rPr>
+          <w:rFonts w:ascii="Courier New" w:hAnsi="Courier New"/>
+          <w:color w:val="141414"/>
+          <w:sz w:val="20"/>
+        </w:rPr>
+        <w:t>browserUrl</w:t>
+      </w:r>
+      <w:r>
+        <w:rPr>
+          <w:rFonts w:ascii="Arial" w:hAnsi="Arial"/>
+          <w:sz w:val="22"/>
+        </w:rPr>
+        <w:t xml:space="preserve"> вида </w:t>
+      </w:r>
+      <w:r>
+        <w:rPr>
+          <w:rFonts w:ascii="Courier New" w:hAnsi="Courier New"/>
+          <w:color w:val="141414"/>
+          <w:sz w:val="20"/>
+        </w:rPr>
+        <w:t>http://localhost:3001/d/&lt;uid&gt;/&lt;slug&gt;</w:t>
+      </w:r>
+      <w:r>
+        <w:rPr>
+          <w:rFonts w:ascii="Arial" w:hAnsi="Arial"/>
+          <w:sz w:val="22"/>
+        </w:rPr>
+        <w:t>.</w:t>
+      </w:r>
+    </w:p>
+    <w:p>
+      <w:r>
+        <w:rPr>
+          <w:rFonts w:ascii="Arial" w:hAnsi="Arial"/>
+          <w:sz w:val="22"/>
+        </w:rPr>
+        <w:t>Примеры запросов:</w:t>
+      </w:r>
+    </w:p>
+    <w:p>
+      <w:pPr>
+        <w:spacing w:before="60" w:after="120"/>
+      </w:pPr>
+      <w:r>
+        <w:rPr>
+          <w:rFonts w:ascii="Courier New" w:hAnsi="Courier New"/>
+          <w:sz w:val="17"/>
+        </w:rPr>
+        <w:t>Создай dashboard по складам автомобилей: количество машин по городам и брендам.</w:t>
+      </w:r>
+    </w:p>
+    <w:p>
+      <w:r>
+        <w:rPr>
+          <w:rFonts w:ascii="Arial" w:hAnsi="Arial"/>
+          <w:sz w:val="22"/>
+        </w:rPr>
+        <w:t>![img_1.png](img_1.png)</w:t>
+      </w:r>
+    </w:p>
+    <w:p>
+      <w:pPr>
+        <w:spacing w:before="60" w:after="120"/>
+      </w:pPr>
+      <w:r>
+        <w:rPr>
+          <w:rFonts w:ascii="Courier New" w:hAnsi="Courier New"/>
+          <w:sz w:val="17"/>
+        </w:rPr>
+        <w:t>Создай Grafana dashboard по inventory: сколько машин с пробегом больше 20000 в каждом городе.</w:t>
+      </w:r>
+    </w:p>
+    <w:p>
+      <w:r>
+        <w:rPr>
+          <w:rFonts w:ascii="Arial" w:hAnsi="Arial"/>
+          <w:sz w:val="22"/>
+        </w:rPr>
+        <w:t>![img_3.png](img_3.png)</w:t>
       </w:r>
     </w:p>
     <w:p>

</xml_diff>

<commit_message>
Clean Grafana dashboard tool output
</commit_message>
<xml_diff>
--- a/docs/JUNIOR_DEVOPS_DEPLOYMENT_GUIDE.docx
+++ b/docs/JUNIOR_DEVOPS_DEPLOYMENT_GUIDE.docx
@@ -1094,25 +1094,16 @@
           <w:rFonts w:ascii="Arial" w:hAnsi="Arial"/>
           <w:sz w:val="22"/>
         </w:rPr>
-        <w:t>Важно: ClickHouse sink не подключается к внешней БД.</w:t>
-      </w:r>
-    </w:p>
-    <w:p>
-      <w:r>
-        <w:rPr>
-          <w:rFonts w:ascii="Arial" w:hAnsi="Arial"/>
-          <w:sz w:val="22"/>
-        </w:rPr>
-        <w:t>Он работает только после Debezium и Redpanda.</w:t>
-      </w:r>
-    </w:p>
-    <w:p>
-      <w:r>
-        <w:rPr>
-          <w:rFonts w:ascii="Arial" w:hAnsi="Arial"/>
-          <w:sz w:val="22"/>
-        </w:rPr>
-        <w:t>Конфиг находится здесь:</w:t>
+        <w:t>Важно: ClickHouse sink не подключается к внешней БД, а работает только после Debezium и Redpanda.</w:t>
+      </w:r>
+    </w:p>
+    <w:p>
+      <w:r>
+        <w:rPr>
+          <w:rFonts w:ascii="Arial" w:hAnsi="Arial"/>
+          <w:sz w:val="22"/>
+        </w:rPr>
+        <w:t>Конфиг лежит здесь:</w:t>
       </w:r>
     </w:p>
     <w:p>
@@ -1239,6 +1230,15 @@
           <w:sz w:val="22"/>
         </w:rPr>
         <w:t>Второй вариант полезен, когда source-БД чужая и заранее неизвестно, какие таблицы и поля придется мигрировать.</w:t>
+      </w:r>
+    </w:p>
+    <w:p>
+      <w:r>
+        <w:rPr>
+          <w:rFonts w:ascii="Arial" w:hAnsi="Arial"/>
+          <w:sz w:val="22"/>
+        </w:rPr>
+        <w:t>Оба варианта реализованы в проекте.</w:t>
       </w:r>
     </w:p>
     <w:p>
@@ -30944,7 +30944,22 @@
           <w:rFonts w:ascii="Arial" w:hAnsi="Arial"/>
           <w:sz w:val="22"/>
         </w:rPr>
-        <w:t>, HTTP latency/traffic и DB disk/lag/query метрики.</w:t>
+        <w:t xml:space="preserve">, HTTP latency/traffic и DB disk/lag/query метрики. В availability-панелях служебный </w:t>
+      </w:r>
+      <w:r>
+        <w:rPr>
+          <w:rFonts w:ascii="Courier New" w:hAnsi="Courier New"/>
+          <w:color w:val="141414"/>
+          <w:sz w:val="20"/>
+        </w:rPr>
+        <w:t>synthetic-exporter:9201</w:t>
+      </w:r>
+      <w:r>
+        <w:rPr>
+          <w:rFonts w:ascii="Arial" w:hAnsi="Arial"/>
+          <w:sz w:val="22"/>
+        </w:rPr>
+        <w:t xml:space="preserve"> скрывается, чтобы dashboard показывал реальные application/database targets.</w:t>
       </w:r>
     </w:p>
     <w:p>

</xml_diff>

<commit_message>
Update deployment guide docs
</commit_message>
<xml_diff>
--- a/docs/JUNIOR_DEVOPS_DEPLOYMENT_GUIDE.docx
+++ b/docs/JUNIOR_DEVOPS_DEPLOYMENT_GUIDE.docx
@@ -1514,7 +1514,16 @@
           <w:rFonts w:ascii="Arial" w:hAnsi="Arial"/>
           <w:sz w:val="22"/>
         </w:rPr>
-        <w:t>Модель через MCP tools обращается к ClickHouse и Grafana.</w:t>
+        <w:t>Модель через MCP tools обращается к ClickHouse.</w:t>
+      </w:r>
+    </w:p>
+    <w:p>
+      <w:r>
+        <w:rPr>
+          <w:rFonts w:ascii="Arial" w:hAnsi="Arial"/>
+          <w:sz w:val="22"/>
+        </w:rPr>
+        <w:t>Ответ собирается из вопроса пользователя и ответа от ClickHouse&amp;</w:t>
       </w:r>
     </w:p>
     <w:p>
@@ -1573,10 +1582,13 @@
           <w:rFonts w:ascii="Arial" w:hAnsi="Arial"/>
           <w:sz w:val="22"/>
         </w:rPr>
-        <w:t xml:space="preserve"> делает две вещи.</w:t>
-      </w:r>
-    </w:p>
-    <w:p>
+        <w:t xml:space="preserve"> делает две вещи:</w:t>
+      </w:r>
+    </w:p>
+    <w:p>
+      <w:pPr>
+        <w:pStyle w:val="ListBullet"/>
+      </w:pPr>
       <w:r>
         <w:rPr>
           <w:rFonts w:ascii="Arial" w:hAnsi="Arial"/>
@@ -1610,6 +1622,9 @@
       </w:r>
     </w:p>
     <w:p>
+      <w:pPr>
+        <w:pStyle w:val="ListBullet"/>
+      </w:pPr>
       <w:r>
         <w:rPr>
           <w:rFonts w:ascii="Arial" w:hAnsi="Arial"/>
@@ -31078,7 +31093,7 @@
           <w:rFonts w:ascii="Arial" w:hAnsi="Arial"/>
           <w:sz w:val="22"/>
         </w:rPr>
-        <w:t>Примеры запросов:</w:t>
+        <w:t>Пример запроса:</w:t>
       </w:r>
     </w:p>
     <w:p>
@@ -31090,67 +31105,25 @@
           <w:rFonts w:ascii="Courier New" w:hAnsi="Courier New"/>
           <w:sz w:val="17"/>
         </w:rPr>
-        <w:t>Проанализируй Prometheus targets: какие instance сейчас down?</w:t>
-      </w:r>
-    </w:p>
-    <w:p>
-      <w:pPr>
-        <w:spacing w:before="60" w:after="120"/>
-      </w:pPr>
-      <w:r>
-        <w:rPr>
-          <w:rFonts w:ascii="Courier New" w:hAnsi="Courier New"/>
-          <w:sz w:val="17"/>
-        </w:rPr>
-        <w:t>Покажи последние samples метрики up и объясни, какие targets проблемные.</w:t>
-      </w:r>
-    </w:p>
-    <w:p>
-      <w:pPr>
-        <w:spacing w:before="60" w:after="120"/>
-      </w:pPr>
-      <w:r>
-        <w:rPr>
-          <w:rFonts w:ascii="Courier New" w:hAnsi="Courier New"/>
-          <w:sz w:val="17"/>
-        </w:rPr>
-        <w:t>Какие значения label job есть у метрики http_requests_total?</w:t>
-      </w:r>
-    </w:p>
-    <w:p>
-      <w:pPr>
-        <w:spacing w:before="60" w:after="120"/>
-      </w:pPr>
-      <w:r>
-        <w:rPr>
-          <w:rFonts w:ascii="Courier New" w:hAnsi="Courier New"/>
-          <w:sz w:val="17"/>
-        </w:rPr>
-        <w:t>Создай в Grafana dashboard по метрике up с разбивкой по job за последние 24 часа и дай ссылку.</w:t>
-      </w:r>
-    </w:p>
-    <w:p>
-      <w:pPr>
-        <w:spacing w:before="60" w:after="120"/>
-      </w:pPr>
-      <w:r>
-        <w:rPr>
-          <w:rFonts w:ascii="Courier New" w:hAnsi="Courier New"/>
-          <w:sz w:val="17"/>
-        </w:rPr>
-        <w:t>Проанализируй prometheus_samples: какие instance и когда down, какие up? Сделай Grafana dashboard.</w:t>
-      </w:r>
-    </w:p>
-    <w:p>
-      <w:pPr>
-        <w:spacing w:before="60" w:after="120"/>
-      </w:pPr>
-      <w:r>
-        <w:rPr>
-          <w:rFonts w:ascii="Courier New" w:hAnsi="Courier New"/>
-          <w:sz w:val="17"/>
-        </w:rPr>
         <w:t>Создай красивый operational dashboard по Prometheus: availability, incidents, HTTP latency, HTTP errors, DB disk usage и replication lag.</w:t>
+      </w:r>
+    </w:p>
+    <w:p>
+      <w:r>
+        <w:rPr>
+          <w:rFonts w:ascii="Arial" w:hAnsi="Arial"/>
+          <w:sz w:val="22"/>
+        </w:rPr>
+        <w:t>![img_6.png](img_6.png)</w:t>
+      </w:r>
+    </w:p>
+    <w:p>
+      <w:r>
+        <w:rPr>
+          <w:rFonts w:ascii="Arial" w:hAnsi="Arial"/>
+          <w:sz w:val="22"/>
+        </w:rPr>
+        <w:t>![img_4.png](img_4.png)</w:t>
       </w:r>
     </w:p>
     <w:p>

</xml_diff>